<commit_message>
Task 1 is completed
</commit_message>
<xml_diff>
--- a/report/Large_Scale_E_commerce_Behaviour_Analysis_Report.docx
+++ b/report/Large_Scale_E_commerce_Behaviour_Analysis_Report.docx
@@ -695,89 +695,79 @@
         <w:t>behavior</w:t>
       </w:r>
       <w:r>
-        <w:t xml:space="preserve"> and gain insights into customer experiences </w:t>
-      </w:r>
-      <w:r>
+        <w:t xml:space="preserve"> and gain insights into customer </w:t>
+      </w:r>
+      <w:r>
+        <w:t xml:space="preserve">experiences </w:t>
+      </w:r>
+      <w:r>
+        <w:t>(Theodorakopoulos and Theodoropoulou, 2024)</w:t>
+      </w:r>
+      <w:r>
+        <w:t>.</w:t>
+      </w:r>
+    </w:p>
+    <w:p>
+      <w:pPr>
         <w:rPr>
           <w:b/>
           <w:bCs/>
         </w:rPr>
-        <w:t>(Theodoropoulou et al., 2024).</w:t>
-      </w:r>
-    </w:p>
-    <w:p>
-      <w:pPr>
+      </w:pPr>
+      <w:r>
+        <w:t xml:space="preserve">In this project, the </w:t>
+      </w:r>
+      <w:r>
         <w:rPr>
           <w:b/>
           <w:bCs/>
         </w:rPr>
-      </w:pPr>
-      <w:r>
-        <w:t xml:space="preserve">In this project, the </w:t>
+        <w:t>“eCommerce behavior data from a multi-category store”</w:t>
+      </w:r>
+      <w:r>
+        <w:t xml:space="preserve"> dataset from October 2019 was </w:t>
+      </w:r>
+      <w:r>
+        <w:t>analyzed</w:t>
+      </w:r>
+      <w:r>
+        <w:t xml:space="preserve">. The dataset is approximately </w:t>
       </w:r>
       <w:r>
         <w:rPr>
           <w:b/>
           <w:bCs/>
         </w:rPr>
-        <w:t>“eCommerce behavior data from a multi-category store”</w:t>
-      </w:r>
-      <w:r>
-        <w:t xml:space="preserve"> dataset from October 2019 was </w:t>
-      </w:r>
-      <w:r>
-        <w:t>analyzed</w:t>
-      </w:r>
-      <w:r>
-        <w:t xml:space="preserve">. The dataset is approximately </w:t>
+        <w:t>5.67 GB in size and contains 42.4 million records</w:t>
+      </w:r>
+      <w:r>
+        <w:t xml:space="preserve">. Due to its large size and variety, the dataset provides an appropriate environment for applying big data technologies, as it contains data such as the number of product views, products added to the shopping cart, and purchases made by users. Big data analytics is used in different fields to obtain meaningful information from large and complex datasets and to perform predictive analysis </w:t>
+      </w:r>
+      <w:r>
+        <w:t>(</w:t>
+      </w:r>
+      <w:proofErr w:type="spellStart"/>
+      <w:r>
+        <w:t>Jamarani</w:t>
+      </w:r>
+      <w:proofErr w:type="spellEnd"/>
+      <w:r>
+        <w:t xml:space="preserve"> et al., 2024).</w:t>
       </w:r>
       <w:r>
         <w:rPr>
           <w:b/>
           <w:bCs/>
         </w:rPr>
-        <w:t>5.67 GB in size and contains 42.4 million records</w:t>
-      </w:r>
-      <w:r>
-        <w:t xml:space="preserve">. Due to its large size and variety, the dataset provides an appropriate environment for applying big data technologies, as it contains data such as the number of product views, products added to the shopping cart, and purchases made by users. Big data analytics is used in different fields to obtain meaningful information from large and complex datasets and to perform predictive analysis </w:t>
-      </w:r>
-      <w:r>
+        <w:t xml:space="preserve"> </w:t>
+      </w:r>
+    </w:p>
+    <w:p>
+      <w:pPr>
         <w:rPr>
           <w:b/>
           <w:bCs/>
         </w:rPr>
-        <w:t>(</w:t>
-      </w:r>
-      <w:proofErr w:type="spellStart"/>
-      <w:r>
-        <w:rPr>
-          <w:b/>
-          <w:bCs/>
-        </w:rPr>
-        <w:t>Jamarani</w:t>
-      </w:r>
-      <w:proofErr w:type="spellEnd"/>
-      <w:r>
-        <w:rPr>
-          <w:b/>
-          <w:bCs/>
-        </w:rPr>
-        <w:t xml:space="preserve"> et al., 2024).</w:t>
-      </w:r>
-      <w:r>
-        <w:rPr>
-          <w:b/>
-          <w:bCs/>
-        </w:rPr>
-        <w:t xml:space="preserve"> </w:t>
-      </w:r>
-    </w:p>
-    <w:p>
-      <w:pPr>
-        <w:rPr>
-          <w:b/>
-          <w:bCs/>
-        </w:rPr>
       </w:pPr>
       <w:r>
         <w:t xml:space="preserve">Different big data technologies were used in this project to store and process the large amount of data. The dataset was stored on Hadoop HDFS, while Hadoop MapReduce and Apache Spark were used for distributed data processing. In addition, a machine learning model was implemented using Spark to </w:t>
@@ -801,11 +791,10 @@
         <w:t xml:space="preserve">. In the e-commerce field, big data analytics architectures support the storage, processing, and analysis of large amounts of e-commerce data and help to generate useful information for businesses </w:t>
       </w:r>
       <w:r>
-        <w:rPr>
-          <w:b/>
-          <w:bCs/>
-        </w:rPr>
-        <w:t>(Applied Sciences, 2023).</w:t>
+        <w:t>(Munshi et al., 2023)</w:t>
+      </w:r>
+      <w:r>
+        <w:t>.</w:t>
       </w:r>
     </w:p>
     <w:p>
@@ -862,14 +851,27 @@
         <w:pStyle w:val="Heading2"/>
         <w:numPr>
           <w:ilvl w:val="1"/>
-          <w:numId w:val="6"/>
+          <w:numId w:val="8"/>
         </w:numPr>
       </w:pPr>
       <w:r>
-        <w:t xml:space="preserve"> </w:t>
-      </w:r>
-      <w:r>
-        <w:t>Business Problem</w:t>
+        <w:t>Business Problem and Context</w:t>
+      </w:r>
+    </w:p>
+    <w:p>
+      <w:pPr>
+        <w:rPr>
+          <w:sz w:val="24"/>
+          <w:szCs w:val="24"/>
+        </w:rPr>
+      </w:pPr>
+      <w:r>
+        <w:t>A large number of user interactions take place on e-commerce platforms every day. As the amount of data continues to grow, analyzing these behaviors becomes increasingly difficult. E-commerce businesses use different technologies to analyze this large amount of user data. The aim of this project is to analyze user behaviors, such as viewing products, adding products to the shopping cart, and making purchases, by using these technologies and to obtain meaningful information about the purchasing process. In particular, the project examines which products and categories receive more attention, how users’ daily activities change, and how the purchasing behavior of users who add products to their shopping carts differs.</w:t>
+      </w:r>
+    </w:p>
+    <w:p>
+      <w:r>
+        <w:t>These analyses can help businesses better understand their users and develop product, category, and customer strategies based on the data obtained.</w:t>
       </w:r>
     </w:p>
     <w:p>
@@ -877,11 +879,56 @@
         <w:pStyle w:val="Heading2"/>
         <w:numPr>
           <w:ilvl w:val="1"/>
-          <w:numId w:val="6"/>
+          <w:numId w:val="8"/>
         </w:numPr>
       </w:pPr>
       <w:r>
-        <w:t>Business Context and Stakeholders</w:t>
+        <w:t>Why Big Data?</w:t>
+      </w:r>
+    </w:p>
+    <w:p>
+      <w:r>
+        <w:t xml:space="preserve">Big Data technologies were used in this project because the dataset contains a large amount of data and includes different user interactions. The dataset used in this project is approximately </w:t>
+      </w:r>
+      <w:r>
+        <w:rPr>
+          <w:b/>
+          <w:bCs/>
+        </w:rPr>
+        <w:t>5.67 GB in size and contains 42.4 million records</w:t>
+      </w:r>
+      <w:r>
+        <w:t xml:space="preserve">. Storing, processing, and </w:t>
+      </w:r>
+      <w:r>
+        <w:t>analyzing</w:t>
+      </w:r>
+      <w:r>
+        <w:t xml:space="preserve"> data of this size can be very difficult using traditional methods. Therefore, </w:t>
+      </w:r>
+      <w:r>
+        <w:rPr>
+          <w:b/>
+          <w:bCs/>
+        </w:rPr>
+        <w:t>Hadoop HDFS, Hadoop MapReduce, and Apache Spark</w:t>
+      </w:r>
+      <w:r>
+        <w:t xml:space="preserve"> were used to store and process the large amount of data in a distributed way</w:t>
+      </w:r>
+      <w:r>
+        <w:t xml:space="preserve"> </w:t>
+      </w:r>
+      <w:r>
+        <w:t>(</w:t>
+      </w:r>
+      <w:proofErr w:type="spellStart"/>
+      <w:r>
+        <w:t>Jamarani</w:t>
+      </w:r>
+      <w:proofErr w:type="spellEnd"/>
+      <w:r>
+        <w:t xml:space="preserve"> et al., 2024).</w:t>
       </w:r>
     </w:p>
     <w:p>
@@ -889,11 +936,142 @@
         <w:pStyle w:val="Heading2"/>
         <w:numPr>
           <w:ilvl w:val="1"/>
-          <w:numId w:val="6"/>
+          <w:numId w:val="8"/>
         </w:numPr>
       </w:pPr>
       <w:r>
-        <w:t>Why Big Data?</w:t>
+        <w:t>Five Vs of Big Data</w:t>
+      </w:r>
+    </w:p>
+    <w:p>
+      <w:pPr>
+        <w:rPr>
+          <w:sz w:val="24"/>
+          <w:szCs w:val="24"/>
+        </w:rPr>
+      </w:pPr>
+      <w:r>
+        <w:rPr>
+          <w:rStyle w:val="Strong"/>
+        </w:rPr>
+        <w:t>Volume:</w:t>
+      </w:r>
+      <w:r>
+        <w:br/>
+        <w:t xml:space="preserve">The dataset has a large volume of data. The October 2019 dataset is approximately </w:t>
+      </w:r>
+      <w:r>
+        <w:rPr>
+          <w:rStyle w:val="Strong"/>
+        </w:rPr>
+        <w:t>5.67 GB in size and contains 42.4 million records</w:t>
+      </w:r>
+      <w:r>
+        <w:t>. Therefore, data volume is an important Big Data characteristic of this project.</w:t>
+      </w:r>
+    </w:p>
+    <w:p>
+      <w:r>
+        <w:rPr>
+          <w:rStyle w:val="Strong"/>
+        </w:rPr>
+        <w:t>Velocity:</w:t>
+      </w:r>
+      <w:r>
+        <w:br/>
+        <w:t>User interactions on e-commerce platforms occur continuously. Activities such as product views, adding products to the shopping cart, and purchases can generate a large number of events within a short period of time.</w:t>
+      </w:r>
+    </w:p>
+    <w:p>
+      <w:r>
+        <w:rPr>
+          <w:rStyle w:val="Strong"/>
+        </w:rPr>
+        <w:t>Variety:</w:t>
+      </w:r>
+      <w:r>
+        <w:br/>
+        <w:t>The dataset contains different types of information. Along with user activities, it includes variables such as products, categories, brands, prices, and user sessions.</w:t>
+      </w:r>
+    </w:p>
+    <w:p>
+      <w:r>
+        <w:rPr>
+          <w:rStyle w:val="Strong"/>
+        </w:rPr>
+        <w:t>Veracity:</w:t>
+      </w:r>
+      <w:r>
+        <w:br/>
+        <w:t xml:space="preserve">The dataset contains some missing values. In particular, missing values are present in the </w:t>
+      </w:r>
+      <w:proofErr w:type="spellStart"/>
+      <w:r>
+        <w:rPr>
+          <w:rStyle w:val="Strong"/>
+        </w:rPr>
+        <w:t>category_code</w:t>
+      </w:r>
+      <w:proofErr w:type="spellEnd"/>
+      <w:r>
+        <w:t xml:space="preserve"> and </w:t>
+      </w:r>
+      <w:r>
+        <w:rPr>
+          <w:rStyle w:val="Strong"/>
+        </w:rPr>
+        <w:t>brand</w:t>
+      </w:r>
+      <w:r>
+        <w:t xml:space="preserve"> fields, making it necessary to check data quality before analysis.</w:t>
+      </w:r>
+    </w:p>
+    <w:p>
+      <w:r>
+        <w:rPr>
+          <w:rStyle w:val="Strong"/>
+        </w:rPr>
+        <w:lastRenderedPageBreak/>
+        <w:t>Value:</w:t>
+      </w:r>
+      <w:r>
+        <w:br/>
+      </w:r>
+      <w:proofErr w:type="spellStart"/>
+      <w:r>
+        <w:t>Analysing</w:t>
+      </w:r>
+      <w:proofErr w:type="spellEnd"/>
+      <w:r>
+        <w:t xml:space="preserve"> the dataset can provide useful information about users' product and category preferences, purchasing </w:t>
+      </w:r>
+      <w:proofErr w:type="spellStart"/>
+      <w:r>
+        <w:t>behaviour</w:t>
+      </w:r>
+      <w:proofErr w:type="spellEnd"/>
+      <w:r>
+        <w:t xml:space="preserve">, and shopping cart activities. These insights can support data-driven decision-making in e-commerce businesses </w:t>
+      </w:r>
+      <w:r>
+        <w:rPr>
+          <w:rStyle w:val="Strong"/>
+        </w:rPr>
+        <w:t>(</w:t>
+      </w:r>
+      <w:proofErr w:type="spellStart"/>
+      <w:r>
+        <w:rPr>
+          <w:rStyle w:val="Strong"/>
+        </w:rPr>
+        <w:t>Jamarani</w:t>
+      </w:r>
+      <w:proofErr w:type="spellEnd"/>
+      <w:r>
+        <w:rPr>
+          <w:rStyle w:val="Strong"/>
+        </w:rPr>
+        <w:t xml:space="preserve"> et al., 2024).</w:t>
       </w:r>
     </w:p>
     <w:p>
@@ -901,11 +1079,565 @@
         <w:pStyle w:val="Heading2"/>
         <w:numPr>
           <w:ilvl w:val="1"/>
-          <w:numId w:val="6"/>
+          <w:numId w:val="8"/>
         </w:numPr>
       </w:pPr>
       <w:r>
-        <w:t>Five Vs of Big Data</w:t>
+        <w:t>Dataset Selection and Characteristics</w:t>
+      </w:r>
+    </w:p>
+    <w:p>
+      <w:pPr>
+        <w:rPr>
+          <w:rFonts w:asciiTheme="minorHAnsi" w:hAnsiTheme="minorHAnsi" w:cstheme="minorHAnsi"/>
+        </w:rPr>
+      </w:pPr>
+      <w:r>
+        <w:rPr>
+          <w:rFonts w:asciiTheme="minorHAnsi" w:hAnsiTheme="minorHAnsi" w:cstheme="minorHAnsi"/>
+        </w:rPr>
+        <w:t xml:space="preserve">In this project, the </w:t>
+      </w:r>
+      <w:r>
+        <w:rPr>
+          <w:rFonts w:asciiTheme="minorHAnsi" w:hAnsiTheme="minorHAnsi" w:cstheme="minorHAnsi"/>
+          <w:b/>
+          <w:bCs/>
+        </w:rPr>
+        <w:t>“eCommerce behavior data from a multi-category store”</w:t>
+      </w:r>
+      <w:r>
+        <w:rPr>
+          <w:rFonts w:asciiTheme="minorHAnsi" w:hAnsiTheme="minorHAnsi" w:cstheme="minorHAnsi"/>
+        </w:rPr>
+        <w:t xml:space="preserve"> dataset was used. The dataset was obtained from Kaggle and contains user activities from a multi-category e-commerce store during October 2019. The size of the dataset and the variety of user interactions make it a suitable dataset for applying big data technologies.</w:t>
+      </w:r>
+      <w:r>
+        <w:rPr>
+          <w:rFonts w:asciiTheme="minorHAnsi" w:hAnsiTheme="minorHAnsi" w:cstheme="minorHAnsi"/>
+          <w:noProof/>
+        </w:rPr>
+        <w:drawing>
+          <wp:inline distT="0" distB="0" distL="0" distR="0" wp14:anchorId="0B25C3AE" wp14:editId="17CD61D4">
+            <wp:extent cx="5943600" cy="2940050"/>
+            <wp:effectExtent l="0" t="0" r="0" b="0"/>
+            <wp:docPr id="266259720" name="Picture 1"/>
+            <wp:cNvGraphicFramePr>
+              <a:graphicFrameLocks xmlns:a="http://schemas.openxmlformats.org/drawingml/2006/main" noChangeAspect="1"/>
+            </wp:cNvGraphicFramePr>
+            <a:graphic xmlns:a="http://schemas.openxmlformats.org/drawingml/2006/main">
+              <a:graphicData uri="http://schemas.openxmlformats.org/drawingml/2006/picture">
+                <pic:pic xmlns:pic="http://schemas.openxmlformats.org/drawingml/2006/picture">
+                  <pic:nvPicPr>
+                    <pic:cNvPr id="0" name="Picture 1"/>
+                    <pic:cNvPicPr>
+                      <a:picLocks noChangeAspect="1" noChangeArrowheads="1"/>
+                    </pic:cNvPicPr>
+                  </pic:nvPicPr>
+                  <pic:blipFill>
+                    <a:blip r:embed="rId9">
+                      <a:extLst>
+                        <a:ext uri="{28A0092B-C50C-407E-A947-70E740481C1C}">
+                          <a14:useLocalDpi xmlns:a14="http://schemas.microsoft.com/office/drawing/2010/main" val="0"/>
+                        </a:ext>
+                      </a:extLst>
+                    </a:blip>
+                    <a:srcRect/>
+                    <a:stretch>
+                      <a:fillRect/>
+                    </a:stretch>
+                  </pic:blipFill>
+                  <pic:spPr bwMode="auto">
+                    <a:xfrm>
+                      <a:off x="0" y="0"/>
+                      <a:ext cx="5943600" cy="2940050"/>
+                    </a:xfrm>
+                    <a:prstGeom prst="rect">
+                      <a:avLst/>
+                    </a:prstGeom>
+                    <a:noFill/>
+                    <a:ln>
+                      <a:noFill/>
+                    </a:ln>
+                  </pic:spPr>
+                </pic:pic>
+              </a:graphicData>
+            </a:graphic>
+          </wp:inline>
+        </w:drawing>
+      </w:r>
+    </w:p>
+    <w:p>
+      <w:pPr>
+        <w:jc w:val="center"/>
+        <w:rPr>
+          <w:rFonts w:asciiTheme="minorHAnsi" w:hAnsiTheme="minorHAnsi" w:cstheme="minorHAnsi"/>
+        </w:rPr>
+      </w:pPr>
+      <w:r>
+        <w:rPr>
+          <w:rFonts w:asciiTheme="minorHAnsi" w:hAnsiTheme="minorHAnsi" w:cstheme="minorHAnsi"/>
+          <w:b/>
+          <w:bCs/>
+        </w:rPr>
+        <w:t>Figure 1.</w:t>
+      </w:r>
+      <w:r>
+        <w:rPr>
+          <w:rFonts w:asciiTheme="minorHAnsi" w:hAnsiTheme="minorHAnsi" w:cstheme="minorHAnsi"/>
+        </w:rPr>
+        <w:t xml:space="preserve"> Dataset file size</w:t>
+      </w:r>
+    </w:p>
+    <w:p>
+      <w:pPr>
+        <w:rPr>
+          <w:rFonts w:asciiTheme="minorHAnsi" w:hAnsiTheme="minorHAnsi" w:cstheme="minorHAnsi"/>
+        </w:rPr>
+      </w:pPr>
+      <w:r>
+        <w:rPr>
+          <w:rFonts w:asciiTheme="minorHAnsi" w:hAnsiTheme="minorHAnsi" w:cstheme="minorHAnsi"/>
+        </w:rPr>
+        <w:t xml:space="preserve">The dataset consists of </w:t>
+      </w:r>
+      <w:r>
+        <w:rPr>
+          <w:rFonts w:asciiTheme="minorHAnsi" w:hAnsiTheme="minorHAnsi" w:cstheme="minorHAnsi"/>
+          <w:b/>
+          <w:bCs/>
+        </w:rPr>
+        <w:t>42,448,764 records and 9 variables</w:t>
+      </w:r>
+      <w:r>
+        <w:rPr>
+          <w:rFonts w:asciiTheme="minorHAnsi" w:hAnsiTheme="minorHAnsi" w:cstheme="minorHAnsi"/>
+        </w:rPr>
+        <w:t xml:space="preserve">. These variables are </w:t>
+      </w:r>
+      <w:proofErr w:type="spellStart"/>
+      <w:r>
+        <w:rPr>
+          <w:rFonts w:asciiTheme="minorHAnsi" w:hAnsiTheme="minorHAnsi" w:cstheme="minorHAnsi"/>
+        </w:rPr>
+        <w:t>event_time</w:t>
+      </w:r>
+      <w:proofErr w:type="spellEnd"/>
+      <w:r>
+        <w:rPr>
+          <w:rFonts w:asciiTheme="minorHAnsi" w:hAnsiTheme="minorHAnsi" w:cstheme="minorHAnsi"/>
+        </w:rPr>
+        <w:t xml:space="preserve">, </w:t>
+      </w:r>
+      <w:proofErr w:type="spellStart"/>
+      <w:r>
+        <w:rPr>
+          <w:rFonts w:asciiTheme="minorHAnsi" w:hAnsiTheme="minorHAnsi" w:cstheme="minorHAnsi"/>
+        </w:rPr>
+        <w:t>event_type</w:t>
+      </w:r>
+      <w:proofErr w:type="spellEnd"/>
+      <w:r>
+        <w:rPr>
+          <w:rFonts w:asciiTheme="minorHAnsi" w:hAnsiTheme="minorHAnsi" w:cstheme="minorHAnsi"/>
+        </w:rPr>
+        <w:t xml:space="preserve">, </w:t>
+      </w:r>
+      <w:proofErr w:type="spellStart"/>
+      <w:r>
+        <w:rPr>
+          <w:rFonts w:asciiTheme="minorHAnsi" w:hAnsiTheme="minorHAnsi" w:cstheme="minorHAnsi"/>
+        </w:rPr>
+        <w:t>product_id</w:t>
+      </w:r>
+      <w:proofErr w:type="spellEnd"/>
+      <w:r>
+        <w:rPr>
+          <w:rFonts w:asciiTheme="minorHAnsi" w:hAnsiTheme="minorHAnsi" w:cstheme="minorHAnsi"/>
+        </w:rPr>
+        <w:t xml:space="preserve">, </w:t>
+      </w:r>
+      <w:proofErr w:type="spellStart"/>
+      <w:r>
+        <w:rPr>
+          <w:rFonts w:asciiTheme="minorHAnsi" w:hAnsiTheme="minorHAnsi" w:cstheme="minorHAnsi"/>
+        </w:rPr>
+        <w:t>category_id</w:t>
+      </w:r>
+      <w:proofErr w:type="spellEnd"/>
+      <w:r>
+        <w:rPr>
+          <w:rFonts w:asciiTheme="minorHAnsi" w:hAnsiTheme="minorHAnsi" w:cstheme="minorHAnsi"/>
+        </w:rPr>
+        <w:t xml:space="preserve">, </w:t>
+      </w:r>
+      <w:proofErr w:type="spellStart"/>
+      <w:r>
+        <w:rPr>
+          <w:rFonts w:asciiTheme="minorHAnsi" w:hAnsiTheme="minorHAnsi" w:cstheme="minorHAnsi"/>
+        </w:rPr>
+        <w:t>category_code</w:t>
+      </w:r>
+      <w:proofErr w:type="spellEnd"/>
+      <w:r>
+        <w:rPr>
+          <w:rFonts w:asciiTheme="minorHAnsi" w:hAnsiTheme="minorHAnsi" w:cstheme="minorHAnsi"/>
+        </w:rPr>
+        <w:t xml:space="preserve">, brand, price, </w:t>
+      </w:r>
+      <w:proofErr w:type="spellStart"/>
+      <w:r>
+        <w:rPr>
+          <w:rFonts w:asciiTheme="minorHAnsi" w:hAnsiTheme="minorHAnsi" w:cstheme="minorHAnsi"/>
+        </w:rPr>
+        <w:t>user_id</w:t>
+      </w:r>
+      <w:proofErr w:type="spellEnd"/>
+      <w:r>
+        <w:rPr>
+          <w:rFonts w:asciiTheme="minorHAnsi" w:hAnsiTheme="minorHAnsi" w:cstheme="minorHAnsi"/>
+        </w:rPr>
+        <w:t xml:space="preserve">, and </w:t>
+      </w:r>
+      <w:proofErr w:type="spellStart"/>
+      <w:r>
+        <w:rPr>
+          <w:rFonts w:asciiTheme="minorHAnsi" w:hAnsiTheme="minorHAnsi" w:cstheme="minorHAnsi"/>
+        </w:rPr>
+        <w:t>user_session</w:t>
+      </w:r>
+      <w:proofErr w:type="spellEnd"/>
+      <w:r>
+        <w:rPr>
+          <w:rFonts w:asciiTheme="minorHAnsi" w:hAnsiTheme="minorHAnsi" w:cstheme="minorHAnsi"/>
+        </w:rPr>
+        <w:t>.</w:t>
+      </w:r>
+    </w:p>
+    <w:p>
+      <w:pPr>
+        <w:rPr>
+          <w:rFonts w:asciiTheme="minorHAnsi" w:hAnsiTheme="minorHAnsi" w:cstheme="minorHAnsi"/>
+        </w:rPr>
+      </w:pPr>
+      <w:r>
+        <w:rPr>
+          <w:rFonts w:asciiTheme="minorHAnsi" w:hAnsiTheme="minorHAnsi" w:cstheme="minorHAnsi"/>
+          <w:noProof/>
+        </w:rPr>
+        <w:lastRenderedPageBreak/>
+        <w:drawing>
+          <wp:inline distT="0" distB="0" distL="0" distR="0" wp14:anchorId="61997574" wp14:editId="573BCBD0">
+            <wp:extent cx="5937250" cy="3702050"/>
+            <wp:effectExtent l="0" t="0" r="6350" b="0"/>
+            <wp:docPr id="682948661" name="Picture 2"/>
+            <wp:cNvGraphicFramePr>
+              <a:graphicFrameLocks xmlns:a="http://schemas.openxmlformats.org/drawingml/2006/main" noChangeAspect="1"/>
+            </wp:cNvGraphicFramePr>
+            <a:graphic xmlns:a="http://schemas.openxmlformats.org/drawingml/2006/main">
+              <a:graphicData uri="http://schemas.openxmlformats.org/drawingml/2006/picture">
+                <pic:pic xmlns:pic="http://schemas.openxmlformats.org/drawingml/2006/picture">
+                  <pic:nvPicPr>
+                    <pic:cNvPr id="0" name="Picture 2"/>
+                    <pic:cNvPicPr>
+                      <a:picLocks noChangeAspect="1" noChangeArrowheads="1"/>
+                    </pic:cNvPicPr>
+                  </pic:nvPicPr>
+                  <pic:blipFill>
+                    <a:blip r:embed="rId10">
+                      <a:extLst>
+                        <a:ext uri="{28A0092B-C50C-407E-A947-70E740481C1C}">
+                          <a14:useLocalDpi xmlns:a14="http://schemas.microsoft.com/office/drawing/2010/main" val="0"/>
+                        </a:ext>
+                      </a:extLst>
+                    </a:blip>
+                    <a:srcRect/>
+                    <a:stretch>
+                      <a:fillRect/>
+                    </a:stretch>
+                  </pic:blipFill>
+                  <pic:spPr bwMode="auto">
+                    <a:xfrm>
+                      <a:off x="0" y="0"/>
+                      <a:ext cx="5937250" cy="3702050"/>
+                    </a:xfrm>
+                    <a:prstGeom prst="rect">
+                      <a:avLst/>
+                    </a:prstGeom>
+                    <a:noFill/>
+                    <a:ln>
+                      <a:noFill/>
+                    </a:ln>
+                  </pic:spPr>
+                </pic:pic>
+              </a:graphicData>
+            </a:graphic>
+          </wp:inline>
+        </w:drawing>
+      </w:r>
+    </w:p>
+    <w:p>
+      <w:pPr>
+        <w:jc w:val="center"/>
+        <w:rPr>
+          <w:rFonts w:asciiTheme="minorHAnsi" w:hAnsiTheme="minorHAnsi" w:cstheme="minorHAnsi"/>
+        </w:rPr>
+      </w:pPr>
+      <w:r>
+        <w:rPr>
+          <w:rFonts w:asciiTheme="minorHAnsi" w:hAnsiTheme="minorHAnsi" w:cstheme="minorHAnsi"/>
+          <w:b/>
+          <w:bCs/>
+        </w:rPr>
+        <w:t xml:space="preserve">Figure 2. </w:t>
+      </w:r>
+      <w:r>
+        <w:rPr>
+          <w:rFonts w:asciiTheme="minorHAnsi" w:hAnsiTheme="minorHAnsi" w:cstheme="minorHAnsi"/>
+        </w:rPr>
+        <w:t>Dataset preview and variables</w:t>
+      </w:r>
+    </w:p>
+    <w:p>
+      <w:pPr>
+        <w:rPr>
+          <w:rFonts w:asciiTheme="minorHAnsi" w:hAnsiTheme="minorHAnsi" w:cstheme="minorHAnsi"/>
+        </w:rPr>
+      </w:pPr>
+      <w:r>
+        <w:rPr>
+          <w:rFonts w:asciiTheme="minorHAnsi" w:hAnsiTheme="minorHAnsi" w:cstheme="minorHAnsi"/>
+        </w:rPr>
+        <w:t xml:space="preserve">The dataset contains </w:t>
+      </w:r>
+      <w:r>
+        <w:rPr>
+          <w:rFonts w:asciiTheme="minorHAnsi" w:hAnsiTheme="minorHAnsi" w:cstheme="minorHAnsi"/>
+          <w:b/>
+          <w:bCs/>
+        </w:rPr>
+        <w:t>42,448,764 records</w:t>
+      </w:r>
+      <w:r>
+        <w:rPr>
+          <w:rFonts w:asciiTheme="minorHAnsi" w:hAnsiTheme="minorHAnsi" w:cstheme="minorHAnsi"/>
+        </w:rPr>
+        <w:t xml:space="preserve">, as confirmed by the record count. The data covers the period from </w:t>
+      </w:r>
+      <w:r>
+        <w:rPr>
+          <w:rFonts w:asciiTheme="minorHAnsi" w:hAnsiTheme="minorHAnsi" w:cstheme="minorHAnsi"/>
+          <w:b/>
+          <w:bCs/>
+        </w:rPr>
+        <w:t>1 October 2019 to 31 October 2019</w:t>
+      </w:r>
+      <w:r>
+        <w:rPr>
+          <w:rFonts w:asciiTheme="minorHAnsi" w:hAnsiTheme="minorHAnsi" w:cstheme="minorHAnsi"/>
+        </w:rPr>
+        <w:t xml:space="preserve"> and includes different user activities such as product views, adding products to the shopping cart, and purchases.</w:t>
+      </w:r>
+    </w:p>
+    <w:p>
+      <w:pPr>
+        <w:jc w:val="center"/>
+        <w:rPr>
+          <w:rFonts w:asciiTheme="minorHAnsi" w:hAnsiTheme="minorHAnsi" w:cstheme="minorHAnsi"/>
+        </w:rPr>
+      </w:pPr>
+      <w:r>
+        <w:rPr>
+          <w:rFonts w:asciiTheme="minorHAnsi" w:hAnsiTheme="minorHAnsi" w:cstheme="minorHAnsi"/>
+          <w:noProof/>
+        </w:rPr>
+        <w:drawing>
+          <wp:inline distT="0" distB="0" distL="0" distR="0" wp14:anchorId="0D56B586" wp14:editId="5B94C624">
+            <wp:extent cx="5937250" cy="552450"/>
+            <wp:effectExtent l="0" t="0" r="6350" b="0"/>
+            <wp:docPr id="2061941085" name="Picture 3"/>
+            <wp:cNvGraphicFramePr>
+              <a:graphicFrameLocks xmlns:a="http://schemas.openxmlformats.org/drawingml/2006/main" noChangeAspect="1"/>
+            </wp:cNvGraphicFramePr>
+            <a:graphic xmlns:a="http://schemas.openxmlformats.org/drawingml/2006/main">
+              <a:graphicData uri="http://schemas.openxmlformats.org/drawingml/2006/picture">
+                <pic:pic xmlns:pic="http://schemas.openxmlformats.org/drawingml/2006/picture">
+                  <pic:nvPicPr>
+                    <pic:cNvPr id="0" name="Picture 3"/>
+                    <pic:cNvPicPr>
+                      <a:picLocks noChangeAspect="1" noChangeArrowheads="1"/>
+                    </pic:cNvPicPr>
+                  </pic:nvPicPr>
+                  <pic:blipFill>
+                    <a:blip r:embed="rId11">
+                      <a:extLst>
+                        <a:ext uri="{28A0092B-C50C-407E-A947-70E740481C1C}">
+                          <a14:useLocalDpi xmlns:a14="http://schemas.microsoft.com/office/drawing/2010/main" val="0"/>
+                        </a:ext>
+                      </a:extLst>
+                    </a:blip>
+                    <a:srcRect/>
+                    <a:stretch>
+                      <a:fillRect/>
+                    </a:stretch>
+                  </pic:blipFill>
+                  <pic:spPr bwMode="auto">
+                    <a:xfrm>
+                      <a:off x="0" y="0"/>
+                      <a:ext cx="5937250" cy="552450"/>
+                    </a:xfrm>
+                    <a:prstGeom prst="rect">
+                      <a:avLst/>
+                    </a:prstGeom>
+                    <a:noFill/>
+                    <a:ln>
+                      <a:noFill/>
+                    </a:ln>
+                  </pic:spPr>
+                </pic:pic>
+              </a:graphicData>
+            </a:graphic>
+          </wp:inline>
+        </w:drawing>
+      </w:r>
+    </w:p>
+    <w:p>
+      <w:pPr>
+        <w:jc w:val="center"/>
+        <w:rPr>
+          <w:rFonts w:asciiTheme="minorHAnsi" w:hAnsiTheme="minorHAnsi" w:cstheme="minorHAnsi"/>
+        </w:rPr>
+      </w:pPr>
+      <w:r>
+        <w:rPr>
+          <w:rFonts w:asciiTheme="minorHAnsi" w:hAnsiTheme="minorHAnsi" w:cstheme="minorHAnsi"/>
+          <w:b/>
+          <w:bCs/>
+        </w:rPr>
+        <w:t>Figure 3.</w:t>
+      </w:r>
+      <w:r>
+        <w:rPr>
+          <w:rFonts w:asciiTheme="minorHAnsi" w:hAnsiTheme="minorHAnsi" w:cstheme="minorHAnsi"/>
+        </w:rPr>
+        <w:t xml:space="preserve"> Total number of dataset records</w:t>
+      </w:r>
+    </w:p>
+    <w:p>
+      <w:pPr>
+        <w:rPr>
+          <w:rFonts w:asciiTheme="minorHAnsi" w:hAnsiTheme="minorHAnsi" w:cstheme="minorHAnsi"/>
+        </w:rPr>
+      </w:pPr>
+      <w:r>
+        <w:rPr>
+          <w:rFonts w:asciiTheme="minorHAnsi" w:hAnsiTheme="minorHAnsi" w:cstheme="minorHAnsi"/>
+        </w:rPr>
+        <w:t xml:space="preserve">The dataset includes three main event types: </w:t>
+      </w:r>
+      <w:r>
+        <w:rPr>
+          <w:rFonts w:asciiTheme="minorHAnsi" w:hAnsiTheme="minorHAnsi" w:cstheme="minorHAnsi"/>
+          <w:b/>
+          <w:bCs/>
+        </w:rPr>
+        <w:t>view, cart, and purchase</w:t>
+      </w:r>
+      <w:r>
+        <w:rPr>
+          <w:rFonts w:asciiTheme="minorHAnsi" w:hAnsiTheme="minorHAnsi" w:cstheme="minorHAnsi"/>
+        </w:rPr>
+        <w:t>. Product views represent the largest proportion of user activities, followed by adding products to the shopping cart and purchases</w:t>
+      </w:r>
+      <w:r>
+        <w:rPr>
+          <w:rFonts w:asciiTheme="minorHAnsi" w:hAnsiTheme="minorHAnsi" w:cstheme="minorHAnsi"/>
+        </w:rPr>
+        <w:t>.</w:t>
+      </w:r>
+    </w:p>
+    <w:p>
+      <w:pPr>
+        <w:jc w:val="center"/>
+        <w:rPr>
+          <w:rFonts w:asciiTheme="minorHAnsi" w:hAnsiTheme="minorHAnsi" w:cstheme="minorHAnsi"/>
+        </w:rPr>
+      </w:pPr>
+      <w:r>
+        <w:rPr>
+          <w:rFonts w:asciiTheme="minorHAnsi" w:hAnsiTheme="minorHAnsi" w:cstheme="minorHAnsi"/>
+          <w:noProof/>
+        </w:rPr>
+        <w:drawing>
+          <wp:inline distT="0" distB="0" distL="0" distR="0" wp14:anchorId="595E6586" wp14:editId="2E95F76F">
+            <wp:extent cx="5943600" cy="603250"/>
+            <wp:effectExtent l="0" t="0" r="0" b="6350"/>
+            <wp:docPr id="1935391846" name="Picture 4"/>
+            <wp:cNvGraphicFramePr>
+              <a:graphicFrameLocks xmlns:a="http://schemas.openxmlformats.org/drawingml/2006/main" noChangeAspect="1"/>
+            </wp:cNvGraphicFramePr>
+            <a:graphic xmlns:a="http://schemas.openxmlformats.org/drawingml/2006/main">
+              <a:graphicData uri="http://schemas.openxmlformats.org/drawingml/2006/picture">
+                <pic:pic xmlns:pic="http://schemas.openxmlformats.org/drawingml/2006/picture">
+                  <pic:nvPicPr>
+                    <pic:cNvPr id="0" name="Picture 4"/>
+                    <pic:cNvPicPr>
+                      <a:picLocks noChangeAspect="1" noChangeArrowheads="1"/>
+                    </pic:cNvPicPr>
+                  </pic:nvPicPr>
+                  <pic:blipFill>
+                    <a:blip r:embed="rId12">
+                      <a:extLst>
+                        <a:ext uri="{28A0092B-C50C-407E-A947-70E740481C1C}">
+                          <a14:useLocalDpi xmlns:a14="http://schemas.microsoft.com/office/drawing/2010/main" val="0"/>
+                        </a:ext>
+                      </a:extLst>
+                    </a:blip>
+                    <a:srcRect/>
+                    <a:stretch>
+                      <a:fillRect/>
+                    </a:stretch>
+                  </pic:blipFill>
+                  <pic:spPr bwMode="auto">
+                    <a:xfrm>
+                      <a:off x="0" y="0"/>
+                      <a:ext cx="5943600" cy="603250"/>
+                    </a:xfrm>
+                    <a:prstGeom prst="rect">
+                      <a:avLst/>
+                    </a:prstGeom>
+                    <a:noFill/>
+                    <a:ln>
+                      <a:noFill/>
+                    </a:ln>
+                  </pic:spPr>
+                </pic:pic>
+              </a:graphicData>
+            </a:graphic>
+          </wp:inline>
+        </w:drawing>
+      </w:r>
+    </w:p>
+    <w:p>
+      <w:pPr>
+        <w:jc w:val="center"/>
+        <w:rPr>
+          <w:rFonts w:asciiTheme="minorHAnsi" w:hAnsiTheme="minorHAnsi" w:cstheme="minorHAnsi"/>
+        </w:rPr>
+      </w:pPr>
+      <w:r>
+        <w:rPr>
+          <w:rFonts w:asciiTheme="minorHAnsi" w:hAnsiTheme="minorHAnsi" w:cstheme="minorHAnsi"/>
+          <w:b/>
+          <w:bCs/>
+        </w:rPr>
+        <w:t>Figure 4.</w:t>
+      </w:r>
+      <w:r>
+        <w:rPr>
+          <w:rFonts w:asciiTheme="minorHAnsi" w:hAnsiTheme="minorHAnsi" w:cstheme="minorHAnsi"/>
+        </w:rPr>
+        <w:t xml:space="preserve"> Distribution of e-commerce event types</w:t>
       </w:r>
     </w:p>
     <w:p>
@@ -913,35 +1645,44 @@
         <w:pStyle w:val="Heading2"/>
         <w:numPr>
           <w:ilvl w:val="1"/>
-          <w:numId w:val="6"/>
+          <w:numId w:val="8"/>
         </w:numPr>
       </w:pPr>
       <w:r>
-        <w:t>Dataset Selection and Source</w:t>
-      </w:r>
-    </w:p>
-    <w:p>
-      <w:pPr>
-        <w:pStyle w:val="Heading2"/>
-        <w:numPr>
-          <w:ilvl w:val="1"/>
-          <w:numId w:val="6"/>
-        </w:numPr>
-      </w:pPr>
-      <w:r>
-        <w:t>Dataset Characteristics and Variables</w:t>
-      </w:r>
-    </w:p>
-    <w:p>
-      <w:pPr>
-        <w:pStyle w:val="Heading2"/>
-        <w:numPr>
-          <w:ilvl w:val="1"/>
-          <w:numId w:val="6"/>
-        </w:numPr>
-      </w:pPr>
-      <w:r>
         <w:t>Ethical and Data Governance Considerations</w:t>
+      </w:r>
+    </w:p>
+    <w:p>
+      <w:r>
+        <w:t xml:space="preserve">As the dataset contains fields related to user </w:t>
+      </w:r>
+      <w:proofErr w:type="spellStart"/>
+      <w:r>
+        <w:t>behaviour</w:t>
+      </w:r>
+      <w:proofErr w:type="spellEnd"/>
+      <w:r>
+        <w:t xml:space="preserve">, such as </w:t>
+      </w:r>
+      <w:proofErr w:type="spellStart"/>
+      <w:r>
+        <w:t>user_id</w:t>
+      </w:r>
+      <w:proofErr w:type="spellEnd"/>
+      <w:r>
+        <w:t xml:space="preserve"> and </w:t>
+      </w:r>
+      <w:proofErr w:type="spellStart"/>
+      <w:r>
+        <w:t>user_session</w:t>
+      </w:r>
+      <w:proofErr w:type="spellEnd"/>
+      <w:r>
+        <w:t xml:space="preserve">, data privacy and ethical considerations were taken into account in this project. The data was used only for analysis, </w:t>
+      </w:r>
+      <w:r>
+        <w:lastRenderedPageBreak/>
+        <w:t>and no actions were taken to access personal user information. In addition, missing values were checked before the analysis in order to identify issues that could affect the reliability of the results.</w:t>
       </w:r>
     </w:p>
     <w:p>
@@ -985,7 +1726,7 @@
         </w:numPr>
       </w:pPr>
       <w:r>
-        <w:t>HDFS</w:t>
+        <w:t>HDFS and Data Storage</w:t>
       </w:r>
     </w:p>
     <w:p>
@@ -996,19 +1737,9 @@
           <w:numId w:val="7"/>
         </w:numPr>
       </w:pPr>
-      <w:proofErr w:type="spellStart"/>
-      <w:r>
-        <w:t>NameNode</w:t>
-      </w:r>
-      <w:proofErr w:type="spellEnd"/>
-      <w:r>
-        <w:t xml:space="preserve"> and </w:t>
-      </w:r>
-      <w:proofErr w:type="spellStart"/>
-      <w:r>
-        <w:t>DataNode</w:t>
-      </w:r>
-      <w:proofErr w:type="spellEnd"/>
+      <w:r>
+        <w:t>HDFS Implementation and Dataset Ingestion</w:t>
+      </w:r>
     </w:p>
     <w:p>
       <w:pPr>
@@ -1019,29 +1750,8 @@
         </w:numPr>
       </w:pPr>
       <w:r>
-        <w:t xml:space="preserve">Secondary </w:t>
-      </w:r>
-      <w:proofErr w:type="spellStart"/>
-      <w:r>
-        <w:t>NameNode</w:t>
-      </w:r>
-      <w:proofErr w:type="spellEnd"/>
-      <w:r>
-        <w:t xml:space="preserve">, </w:t>
-      </w:r>
-      <w:proofErr w:type="spellStart"/>
-      <w:r>
-        <w:t>FSImage</w:t>
-      </w:r>
-      <w:proofErr w:type="spellEnd"/>
-      <w:r>
-        <w:t xml:space="preserve"> and </w:t>
-      </w:r>
-      <w:proofErr w:type="spellStart"/>
-      <w:r>
-        <w:t>EditLog</w:t>
-      </w:r>
-      <w:proofErr w:type="spellEnd"/>
+        <w:t>YARN and Resource Management</w:t>
+      </w:r>
     </w:p>
     <w:p>
       <w:pPr>
@@ -1052,43 +1762,7 @@
         </w:numPr>
       </w:pPr>
       <w:r>
-        <w:t>YARN</w:t>
-      </w:r>
-    </w:p>
-    <w:p>
-      <w:pPr>
-        <w:pStyle w:val="Heading2"/>
-        <w:numPr>
-          <w:ilvl w:val="1"/>
-          <w:numId w:val="7"/>
-        </w:numPr>
-      </w:pPr>
-      <w:r>
-        <w:t>Hadoop Environment Implementation</w:t>
-      </w:r>
-    </w:p>
-    <w:p>
-      <w:pPr>
-        <w:pStyle w:val="Heading2"/>
-        <w:numPr>
-          <w:ilvl w:val="1"/>
-          <w:numId w:val="7"/>
-        </w:numPr>
-      </w:pPr>
-      <w:r>
-        <w:t>Dataset Ingestion into HDFS</w:t>
-      </w:r>
-    </w:p>
-    <w:p>
-      <w:pPr>
-        <w:pStyle w:val="Heading2"/>
-        <w:numPr>
-          <w:ilvl w:val="1"/>
-          <w:numId w:val="7"/>
-        </w:numPr>
-      </w:pPr>
-      <w:r>
-        <w:t>HDFS Blocks and Replication</w:t>
+        <w:t>HDFS Blocks, Replication and Checkpointing</w:t>
       </w:r>
     </w:p>
     <w:p>
@@ -1116,6 +1790,8 @@
     <w:p/>
     <w:p/>
     <w:p/>
+    <w:p/>
+    <w:p/>
     <w:p>
       <w:pPr>
         <w:pStyle w:val="Heading1"/>
@@ -1142,6 +1818,7 @@
           <w:numId w:val="7"/>
         </w:numPr>
       </w:pPr>
+      <w:bookmarkStart w:id="2" w:name="_Toc26094243"/>
       <w:r>
         <w:t>Hadoop MapReduce</w:t>
       </w:r>
@@ -1155,7 +1832,7 @@
         </w:numPr>
       </w:pPr>
       <w:r>
-        <w:t>Mapper and Reducer</w:t>
+        <w:t>Hadoop Streaming Implementation</w:t>
       </w:r>
     </w:p>
     <w:p>
@@ -1167,7 +1844,7 @@
         </w:numPr>
       </w:pPr>
       <w:r>
-        <w:t>Hadoop Streaming Job</w:t>
+        <w:t>Apache Spark Processing</w:t>
       </w:r>
     </w:p>
     <w:p>
@@ -1179,7 +1856,7 @@
         </w:numPr>
       </w:pPr>
       <w:r>
-        <w:t>YARN Execution</w:t>
+        <w:t>Spark SQL</w:t>
       </w:r>
     </w:p>
     <w:p>
@@ -1189,30 +1866,10 @@
           <w:ilvl w:val="1"/>
           <w:numId w:val="7"/>
         </w:numPr>
-      </w:pPr>
-      <w:r>
-        <w:t>Apache Spark Processing</w:t>
-      </w:r>
-    </w:p>
-    <w:p>
-      <w:pPr>
-        <w:pStyle w:val="Heading2"/>
-        <w:numPr>
-          <w:ilvl w:val="1"/>
-          <w:numId w:val="7"/>
-        </w:numPr>
-      </w:pPr>
-      <w:r>
-        <w:t>Spark SQL</w:t>
-      </w:r>
-    </w:p>
-    <w:p>
-      <w:pPr>
-        <w:pStyle w:val="Heading2"/>
-        <w:numPr>
-          <w:ilvl w:val="1"/>
-          <w:numId w:val="7"/>
-        </w:numPr>
+        <w:rPr>
+          <w:sz w:val="36"/>
+          <w:szCs w:val="36"/>
+        </w:rPr>
       </w:pPr>
       <w:r>
         <w:t>MapReduce and Spark Comparison</w:t>
@@ -1228,7 +1885,6 @@
           <w:numId w:val="7"/>
         </w:numPr>
       </w:pPr>
-      <w:bookmarkStart w:id="2" w:name="_Toc26094243"/>
       <w:r>
         <w:lastRenderedPageBreak/>
         <w:t>TASK 4: Analytics and Machine Learning</w:t>
@@ -1248,7 +1904,7 @@
         </w:numPr>
       </w:pPr>
       <w:r>
-        <w:t>Data Quality and Preprocessing</w:t>
+        <w:t>Data Quality and Analysis</w:t>
       </w:r>
     </w:p>
     <w:p>
@@ -1278,7 +1934,7 @@
         </w:numPr>
       </w:pPr>
       <w:r>
-        <w:t>Product and Category Analysis</w:t>
+        <w:t>Product, Category and Temporal Analysis</w:t>
       </w:r>
     </w:p>
     <w:p>
@@ -1290,7 +1946,10 @@
         </w:numPr>
       </w:pPr>
       <w:r>
-        <w:t>Temporal Analysis</w:t>
+        <w:t xml:space="preserve">Cart and Purchase </w:t>
+      </w:r>
+      <w:r>
+        <w:t>Behavior</w:t>
       </w:r>
     </w:p>
     <w:p>
@@ -1302,10 +1961,7 @@
         </w:numPr>
       </w:pPr>
       <w:r>
-        <w:t xml:space="preserve">Cart and Purchase </w:t>
-      </w:r>
-      <w:r>
-        <w:t>Behavior</w:t>
+        <w:t>Machine Learning Approach and Results</w:t>
       </w:r>
     </w:p>
     <w:p>
@@ -1317,43 +1973,10 @@
         </w:numPr>
       </w:pPr>
       <w:r>
-        <w:t>Machine Learning Approach</w:t>
-      </w:r>
-    </w:p>
-    <w:p>
-      <w:pPr>
-        <w:pStyle w:val="Heading2"/>
-        <w:numPr>
-          <w:ilvl w:val="1"/>
-          <w:numId w:val="7"/>
-        </w:numPr>
-      </w:pPr>
-      <w:r>
-        <w:t>Logistic Regression Results</w:t>
-      </w:r>
-    </w:p>
-    <w:p>
-      <w:pPr>
-        <w:pStyle w:val="Heading2"/>
-        <w:numPr>
-          <w:ilvl w:val="1"/>
-          <w:numId w:val="7"/>
-        </w:numPr>
-      </w:pPr>
-      <w:r>
         <w:t>Visualizations</w:t>
       </w:r>
-    </w:p>
-    <w:p>
-      <w:pPr>
-        <w:pStyle w:val="Heading2"/>
-        <w:numPr>
-          <w:ilvl w:val="1"/>
-          <w:numId w:val="7"/>
-        </w:numPr>
-      </w:pPr>
-      <w:r>
-        <w:t>Business Insights and Recommendations</w:t>
+      <w:r>
+        <w:t xml:space="preserve"> and Business Insights</w:t>
       </w:r>
     </w:p>
     <w:p>
@@ -1404,6 +2027,234 @@
     </w:p>
     <w:p>
       <w:pPr>
+        <w:pStyle w:val="ListParagraph"/>
+        <w:numPr>
+          <w:ilvl w:val="0"/>
+          <w:numId w:val="9"/>
+        </w:numPr>
+      </w:pPr>
+      <w:r>
+        <w:t xml:space="preserve">Theodorakopoulos, L. and Theodoropoulou, A. (2024) ‘Leveraging Big Data Analytics for Understanding Consumer Behavior in Digital Marketing: A Systematic Review’, </w:t>
+      </w:r>
+      <w:r>
+        <w:rPr>
+          <w:i/>
+          <w:iCs/>
+        </w:rPr>
+        <w:t>Human Behavior and Emerging Technologies</w:t>
+      </w:r>
+      <w:r>
+        <w:t xml:space="preserve">, 2024, Article 3641502. </w:t>
+      </w:r>
+    </w:p>
+    <w:p>
+      <w:pPr>
+        <w:pStyle w:val="ListParagraph"/>
+        <w:ind w:left="360"/>
+      </w:pPr>
+      <w:r>
+        <w:t>Available at:</w:t>
+      </w:r>
+      <w:r>
+        <w:t xml:space="preserve"> </w:t>
+      </w:r>
+      <w:hyperlink r:id="rId13" w:tgtFrame="_new" w:history="1">
+        <w:r>
+          <w:rPr>
+            <w:rStyle w:val="Hyperlink"/>
+          </w:rPr>
+          <w:t>https://onlinelibrary.wiley.com/do</w:t>
+        </w:r>
+        <w:r>
+          <w:rPr>
+            <w:rStyle w:val="Hyperlink"/>
+          </w:rPr>
+          <w:t>i</w:t>
+        </w:r>
+        <w:r>
+          <w:rPr>
+            <w:rStyle w:val="Hyperlink"/>
+          </w:rPr>
+          <w:t>/10.1155/2024/3641502</w:t>
+        </w:r>
+      </w:hyperlink>
+    </w:p>
+    <w:p>
+      <w:pPr>
+        <w:pStyle w:val="ListParagraph"/>
+        <w:ind w:left="360"/>
+      </w:pPr>
+      <w:r>
+        <w:t>(Accessed: 17 September 2026).</w:t>
+      </w:r>
+    </w:p>
+    <w:p>
+      <w:pPr>
+        <w:pStyle w:val="ListParagraph"/>
+        <w:numPr>
+          <w:ilvl w:val="0"/>
+          <w:numId w:val="9"/>
+        </w:numPr>
+      </w:pPr>
+      <w:proofErr w:type="spellStart"/>
+      <w:r>
+        <w:t>Jamarani</w:t>
+      </w:r>
+      <w:proofErr w:type="spellEnd"/>
+      <w:r>
+        <w:t xml:space="preserve">, A., Haddadi, S., </w:t>
+      </w:r>
+      <w:proofErr w:type="spellStart"/>
+      <w:r>
+        <w:t>Sarvizadeh</w:t>
+      </w:r>
+      <w:proofErr w:type="spellEnd"/>
+      <w:r>
+        <w:t xml:space="preserve">, R. </w:t>
+      </w:r>
+      <w:r>
+        <w:rPr>
+          <w:i/>
+          <w:iCs/>
+        </w:rPr>
+        <w:t>et al.</w:t>
+      </w:r>
+      <w:r>
+        <w:t xml:space="preserve"> (2024) ‘Big data and predictive analytics: A systematic review of applications’, </w:t>
+      </w:r>
+      <w:r>
+        <w:rPr>
+          <w:i/>
+          <w:iCs/>
+        </w:rPr>
+        <w:t>Artificial Intelligence Review</w:t>
+      </w:r>
+      <w:r>
+        <w:t xml:space="preserve">, 57, Article 176. </w:t>
+      </w:r>
+    </w:p>
+    <w:p>
+      <w:pPr>
+        <w:pStyle w:val="ListParagraph"/>
+        <w:ind w:left="360"/>
+      </w:pPr>
+      <w:r>
+        <w:t xml:space="preserve">Available at: </w:t>
+      </w:r>
+      <w:hyperlink r:id="rId14" w:history="1">
+        <w:r>
+          <w:rPr>
+            <w:rStyle w:val="Hyperlink"/>
+          </w:rPr>
+          <w:t>https://link.spri</w:t>
+        </w:r>
+        <w:r>
+          <w:rPr>
+            <w:rStyle w:val="Hyperlink"/>
+          </w:rPr>
+          <w:t>n</w:t>
+        </w:r>
+        <w:r>
+          <w:rPr>
+            <w:rStyle w:val="Hyperlink"/>
+          </w:rPr>
+          <w:t>ger.com/article/10.1007/s10462-024-10811-5</w:t>
+        </w:r>
+      </w:hyperlink>
+      <w:r>
+        <w:t xml:space="preserve"> </w:t>
+      </w:r>
+    </w:p>
+    <w:p>
+      <w:pPr>
+        <w:pStyle w:val="ListParagraph"/>
+        <w:ind w:left="360"/>
+      </w:pPr>
+      <w:r>
+        <w:t>(Accessed: 17 September 2026).</w:t>
+      </w:r>
+    </w:p>
+    <w:p>
+      <w:pPr>
+        <w:pStyle w:val="ListParagraph"/>
+        <w:numPr>
+          <w:ilvl w:val="0"/>
+          <w:numId w:val="9"/>
+        </w:numPr>
+      </w:pPr>
+      <w:r>
+        <w:t xml:space="preserve">Munshi, A., Alhindi, A., </w:t>
+      </w:r>
+      <w:proofErr w:type="spellStart"/>
+      <w:r>
+        <w:t>Qadah</w:t>
+      </w:r>
+      <w:proofErr w:type="spellEnd"/>
+      <w:r>
+        <w:t xml:space="preserve">, T.M. and </w:t>
+      </w:r>
+      <w:proofErr w:type="spellStart"/>
+      <w:r>
+        <w:t>Alqurashi</w:t>
+      </w:r>
+      <w:proofErr w:type="spellEnd"/>
+      <w:r>
+        <w:t xml:space="preserve">, A. (2023) ‘An Electronic Commerce Big Data Analytics Architecture and Platform’, </w:t>
+      </w:r>
+      <w:r>
+        <w:rPr>
+          <w:i/>
+          <w:iCs/>
+        </w:rPr>
+        <w:t>Applied Sciences</w:t>
+      </w:r>
+      <w:r>
+        <w:t xml:space="preserve">, 13(19), 10962. </w:t>
+      </w:r>
+    </w:p>
+    <w:p>
+      <w:pPr>
+        <w:pStyle w:val="ListParagraph"/>
+        <w:ind w:left="360"/>
+      </w:pPr>
+      <w:r>
+        <w:t xml:space="preserve">Available at: </w:t>
+      </w:r>
+      <w:hyperlink r:id="rId15" w:history="1">
+        <w:r>
+          <w:rPr>
+            <w:rStyle w:val="Hyperlink"/>
+          </w:rPr>
+          <w:t>https://www.mdpi.co</w:t>
+        </w:r>
+        <w:r>
+          <w:rPr>
+            <w:rStyle w:val="Hyperlink"/>
+          </w:rPr>
+          <w:t>m</w:t>
+        </w:r>
+        <w:r>
+          <w:rPr>
+            <w:rStyle w:val="Hyperlink"/>
+          </w:rPr>
+          <w:t>/2076-3417/13/19/10962</w:t>
+        </w:r>
+      </w:hyperlink>
+      <w:r>
+        <w:t xml:space="preserve"> </w:t>
+      </w:r>
+    </w:p>
+    <w:p>
+      <w:pPr>
+        <w:pStyle w:val="ListParagraph"/>
+        <w:ind w:left="360"/>
+      </w:pPr>
+      <w:r>
+        <w:t>(Accessed: 17 September 2026).</w:t>
+      </w:r>
+    </w:p>
+    <w:p>
+      <w:pPr>
         <w:rPr>
           <w:lang w:val="el-GR"/>
         </w:rPr>
@@ -1458,8 +2309,8 @@
       </w:pPr>
     </w:p>
     <w:sectPr>
-      <w:footerReference w:type="even" r:id="rId9"/>
-      <w:footerReference w:type="default" r:id="rId10"/>
+      <w:footerReference w:type="even" r:id="rId16"/>
+      <w:footerReference w:type="default" r:id="rId17"/>
       <w:pgSz w:w="12240" w:h="15840"/>
       <w:pgMar w:top="1440" w:right="1440" w:bottom="1440" w:left="1440" w:header="720" w:footer="720" w:gutter="0"/>
       <w:pgBorders w:display="notFirstPage" w:offsetFrom="page">
@@ -1875,6 +2726,95 @@
     </w:lvl>
   </w:abstractNum>
   <w:abstractNum w:abstractNumId="2" w15:restartNumberingAfterBreak="0">
+    <w:nsid w:val="0E8F3C28"/>
+    <w:multiLevelType w:val="hybridMultilevel"/>
+    <w:tmpl w:val="22FA1B04"/>
+    <w:lvl w:ilvl="0" w:tplc="0409000F">
+      <w:start w:val="1"/>
+      <w:numFmt w:val="decimal"/>
+      <w:lvlText w:val="%1."/>
+      <w:lvlJc w:val="left"/>
+      <w:pPr>
+        <w:ind w:left="360" w:hanging="360"/>
+      </w:pPr>
+      <w:rPr>
+        <w:rFonts w:hint="default"/>
+      </w:rPr>
+    </w:lvl>
+    <w:lvl w:ilvl="1" w:tplc="04090019" w:tentative="1">
+      <w:start w:val="1"/>
+      <w:numFmt w:val="lowerLetter"/>
+      <w:lvlText w:val="%2."/>
+      <w:lvlJc w:val="left"/>
+      <w:pPr>
+        <w:ind w:left="1080" w:hanging="360"/>
+      </w:pPr>
+    </w:lvl>
+    <w:lvl w:ilvl="2" w:tplc="0409001B" w:tentative="1">
+      <w:start w:val="1"/>
+      <w:numFmt w:val="lowerRoman"/>
+      <w:lvlText w:val="%3."/>
+      <w:lvlJc w:val="right"/>
+      <w:pPr>
+        <w:ind w:left="1800" w:hanging="180"/>
+      </w:pPr>
+    </w:lvl>
+    <w:lvl w:ilvl="3" w:tplc="0409000F" w:tentative="1">
+      <w:start w:val="1"/>
+      <w:numFmt w:val="decimal"/>
+      <w:lvlText w:val="%4."/>
+      <w:lvlJc w:val="left"/>
+      <w:pPr>
+        <w:ind w:left="2520" w:hanging="360"/>
+      </w:pPr>
+    </w:lvl>
+    <w:lvl w:ilvl="4" w:tplc="04090019" w:tentative="1">
+      <w:start w:val="1"/>
+      <w:numFmt w:val="lowerLetter"/>
+      <w:lvlText w:val="%5."/>
+      <w:lvlJc w:val="left"/>
+      <w:pPr>
+        <w:ind w:left="3240" w:hanging="360"/>
+      </w:pPr>
+    </w:lvl>
+    <w:lvl w:ilvl="5" w:tplc="0409001B" w:tentative="1">
+      <w:start w:val="1"/>
+      <w:numFmt w:val="lowerRoman"/>
+      <w:lvlText w:val="%6."/>
+      <w:lvlJc w:val="right"/>
+      <w:pPr>
+        <w:ind w:left="3960" w:hanging="180"/>
+      </w:pPr>
+    </w:lvl>
+    <w:lvl w:ilvl="6" w:tplc="0409000F" w:tentative="1">
+      <w:start w:val="1"/>
+      <w:numFmt w:val="decimal"/>
+      <w:lvlText w:val="%7."/>
+      <w:lvlJc w:val="left"/>
+      <w:pPr>
+        <w:ind w:left="4680" w:hanging="360"/>
+      </w:pPr>
+    </w:lvl>
+    <w:lvl w:ilvl="7" w:tplc="04090019" w:tentative="1">
+      <w:start w:val="1"/>
+      <w:numFmt w:val="lowerLetter"/>
+      <w:lvlText w:val="%8."/>
+      <w:lvlJc w:val="left"/>
+      <w:pPr>
+        <w:ind w:left="5400" w:hanging="360"/>
+      </w:pPr>
+    </w:lvl>
+    <w:lvl w:ilvl="8" w:tplc="0409001B" w:tentative="1">
+      <w:start w:val="1"/>
+      <w:numFmt w:val="lowerRoman"/>
+      <w:lvlText w:val="%9."/>
+      <w:lvlJc w:val="right"/>
+      <w:pPr>
+        <w:ind w:left="6120" w:hanging="180"/>
+      </w:pPr>
+    </w:lvl>
+  </w:abstractNum>
+  <w:abstractNum w:abstractNumId="3" w15:restartNumberingAfterBreak="0">
     <w:nsid w:val="1CF231E6"/>
     <w:multiLevelType w:val="multilevel"/>
     <w:tmpl w:val="F3301DA4"/>
@@ -1987,7 +2927,7 @@
       </w:rPr>
     </w:lvl>
   </w:abstractNum>
-  <w:abstractNum w:abstractNumId="3" w15:restartNumberingAfterBreak="0">
+  <w:abstractNum w:abstractNumId="4" w15:restartNumberingAfterBreak="0">
     <w:nsid w:val="3FFC6E51"/>
     <w:multiLevelType w:val="hybridMultilevel"/>
     <w:tmpl w:val="52CCCFD2"/>
@@ -2076,11 +3016,11 @@
       </w:pPr>
     </w:lvl>
   </w:abstractNum>
-  <w:abstractNum w:abstractNumId="4" w15:restartNumberingAfterBreak="0">
+  <w:abstractNum w:abstractNumId="5" w15:restartNumberingAfterBreak="0">
     <w:nsid w:val="52D3220E"/>
-    <w:multiLevelType w:val="hybridMultilevel"/>
-    <w:tmpl w:val="F78EB72C"/>
-    <w:lvl w:ilvl="0" w:tplc="0409000F">
+    <w:multiLevelType w:val="multilevel"/>
+    <w:tmpl w:val="E5442186"/>
+    <w:lvl w:ilvl="0">
       <w:start w:val="1"/>
       <w:numFmt w:val="decimal"/>
       <w:lvlText w:val="%1."/>
@@ -2092,80 +3032,120 @@
         <w:rFonts w:hint="default"/>
       </w:rPr>
     </w:lvl>
-    <w:lvl w:ilvl="1" w:tplc="04090019" w:tentative="1">
-      <w:start w:val="1"/>
-      <w:numFmt w:val="lowerLetter"/>
-      <w:lvlText w:val="%2."/>
-      <w:lvlJc w:val="left"/>
-      <w:pPr>
-        <w:ind w:left="1440" w:hanging="360"/>
-      </w:pPr>
-    </w:lvl>
-    <w:lvl w:ilvl="2" w:tplc="0409001B" w:tentative="1">
-      <w:start w:val="1"/>
-      <w:numFmt w:val="lowerRoman"/>
-      <w:lvlText w:val="%3."/>
-      <w:lvlJc w:val="right"/>
-      <w:pPr>
-        <w:ind w:left="2160" w:hanging="180"/>
-      </w:pPr>
-    </w:lvl>
-    <w:lvl w:ilvl="3" w:tplc="0409000F" w:tentative="1">
-      <w:start w:val="1"/>
-      <w:numFmt w:val="decimal"/>
-      <w:lvlText w:val="%4."/>
-      <w:lvlJc w:val="left"/>
-      <w:pPr>
-        <w:ind w:left="2880" w:hanging="360"/>
-      </w:pPr>
-    </w:lvl>
-    <w:lvl w:ilvl="4" w:tplc="04090019" w:tentative="1">
-      <w:start w:val="1"/>
-      <w:numFmt w:val="lowerLetter"/>
-      <w:lvlText w:val="%5."/>
-      <w:lvlJc w:val="left"/>
-      <w:pPr>
-        <w:ind w:left="3600" w:hanging="360"/>
-      </w:pPr>
-    </w:lvl>
-    <w:lvl w:ilvl="5" w:tplc="0409001B" w:tentative="1">
-      <w:start w:val="1"/>
-      <w:numFmt w:val="lowerRoman"/>
-      <w:lvlText w:val="%6."/>
-      <w:lvlJc w:val="right"/>
-      <w:pPr>
-        <w:ind w:left="4320" w:hanging="180"/>
-      </w:pPr>
-    </w:lvl>
-    <w:lvl w:ilvl="6" w:tplc="0409000F" w:tentative="1">
-      <w:start w:val="1"/>
-      <w:numFmt w:val="decimal"/>
-      <w:lvlText w:val="%7."/>
-      <w:lvlJc w:val="left"/>
-      <w:pPr>
-        <w:ind w:left="5040" w:hanging="360"/>
-      </w:pPr>
-    </w:lvl>
-    <w:lvl w:ilvl="7" w:tplc="04090019" w:tentative="1">
-      <w:start w:val="1"/>
-      <w:numFmt w:val="lowerLetter"/>
-      <w:lvlText w:val="%8."/>
-      <w:lvlJc w:val="left"/>
-      <w:pPr>
-        <w:ind w:left="5760" w:hanging="360"/>
-      </w:pPr>
-    </w:lvl>
-    <w:lvl w:ilvl="8" w:tplc="0409001B" w:tentative="1">
-      <w:start w:val="1"/>
-      <w:numFmt w:val="lowerRoman"/>
-      <w:lvlText w:val="%9."/>
-      <w:lvlJc w:val="right"/>
-      <w:pPr>
-        <w:ind w:left="6480" w:hanging="180"/>
-      </w:pPr>
+    <w:lvl w:ilvl="1">
+      <w:start w:val="1"/>
+      <w:numFmt w:val="decimal"/>
+      <w:isLgl/>
+      <w:lvlText w:val="%1.%2."/>
+      <w:lvlJc w:val="left"/>
+      <w:pPr>
+        <w:ind w:left="1080" w:hanging="720"/>
+      </w:pPr>
+      <w:rPr>
+        <w:rFonts w:hint="default"/>
+        <w:sz w:val="28"/>
+      </w:rPr>
+    </w:lvl>
+    <w:lvl w:ilvl="2">
+      <w:start w:val="1"/>
+      <w:numFmt w:val="decimal"/>
+      <w:isLgl/>
+      <w:lvlText w:val="%1.%2.%3."/>
+      <w:lvlJc w:val="left"/>
+      <w:pPr>
+        <w:ind w:left="1440" w:hanging="1080"/>
+      </w:pPr>
+      <w:rPr>
+        <w:rFonts w:hint="default"/>
+        <w:sz w:val="28"/>
+      </w:rPr>
+    </w:lvl>
+    <w:lvl w:ilvl="3">
+      <w:start w:val="1"/>
+      <w:numFmt w:val="decimal"/>
+      <w:isLgl/>
+      <w:lvlText w:val="%1.%2.%3.%4."/>
+      <w:lvlJc w:val="left"/>
+      <w:pPr>
+        <w:ind w:left="1440" w:hanging="1080"/>
+      </w:pPr>
+      <w:rPr>
+        <w:rFonts w:hint="default"/>
+        <w:sz w:val="28"/>
+      </w:rPr>
+    </w:lvl>
+    <w:lvl w:ilvl="4">
+      <w:start w:val="1"/>
+      <w:numFmt w:val="decimal"/>
+      <w:isLgl/>
+      <w:lvlText w:val="%1.%2.%3.%4.%5."/>
+      <w:lvlJc w:val="left"/>
+      <w:pPr>
+        <w:ind w:left="1800" w:hanging="1440"/>
+      </w:pPr>
+      <w:rPr>
+        <w:rFonts w:hint="default"/>
+        <w:sz w:val="28"/>
+      </w:rPr>
+    </w:lvl>
+    <w:lvl w:ilvl="5">
+      <w:start w:val="1"/>
+      <w:numFmt w:val="decimal"/>
+      <w:isLgl/>
+      <w:lvlText w:val="%1.%2.%3.%4.%5.%6."/>
+      <w:lvlJc w:val="left"/>
+      <w:pPr>
+        <w:ind w:left="2160" w:hanging="1800"/>
+      </w:pPr>
+      <w:rPr>
+        <w:rFonts w:hint="default"/>
+        <w:sz w:val="28"/>
+      </w:rPr>
+    </w:lvl>
+    <w:lvl w:ilvl="6">
+      <w:start w:val="1"/>
+      <w:numFmt w:val="decimal"/>
+      <w:isLgl/>
+      <w:lvlText w:val="%1.%2.%3.%4.%5.%6.%7."/>
+      <w:lvlJc w:val="left"/>
+      <w:pPr>
+        <w:ind w:left="2520" w:hanging="2160"/>
+      </w:pPr>
+      <w:rPr>
+        <w:rFonts w:hint="default"/>
+        <w:sz w:val="28"/>
+      </w:rPr>
+    </w:lvl>
+    <w:lvl w:ilvl="7">
+      <w:start w:val="1"/>
+      <w:numFmt w:val="decimal"/>
+      <w:isLgl/>
+      <w:lvlText w:val="%1.%2.%3.%4.%5.%6.%7.%8."/>
+      <w:lvlJc w:val="left"/>
+      <w:pPr>
+        <w:ind w:left="2520" w:hanging="2160"/>
+      </w:pPr>
+      <w:rPr>
+        <w:rFonts w:hint="default"/>
+        <w:sz w:val="28"/>
+      </w:rPr>
+    </w:lvl>
+    <w:lvl w:ilvl="8">
+      <w:start w:val="1"/>
+      <w:numFmt w:val="decimal"/>
+      <w:isLgl/>
+      <w:lvlText w:val="%1.%2.%3.%4.%5.%6.%7.%8.%9."/>
+      <w:lvlJc w:val="left"/>
+      <w:pPr>
+        <w:ind w:left="2880" w:hanging="2520"/>
+      </w:pPr>
+      <w:rPr>
+        <w:rFonts w:hint="default"/>
+        <w:sz w:val="28"/>
+      </w:rPr>
     </w:lvl>
   </w:abstractNum>
-  <w:abstractNum w:abstractNumId="5" w15:restartNumberingAfterBreak="0">
+  <w:abstractNum w:abstractNumId="6" w15:restartNumberingAfterBreak="0">
     <w:nsid w:val="57786EA3"/>
     <w:multiLevelType w:val="multilevel"/>
     <w:tmpl w:val="859E9B26"/>
@@ -2278,7 +3258,7 @@
       </w:rPr>
     </w:lvl>
   </w:abstractNum>
-  <w:abstractNum w:abstractNumId="6" w15:restartNumberingAfterBreak="0">
+  <w:abstractNum w:abstractNumId="7" w15:restartNumberingAfterBreak="0">
     <w:nsid w:val="5AFF42D4"/>
     <w:multiLevelType w:val="multilevel"/>
     <w:tmpl w:val="E1F8A104"/>
@@ -2391,7 +3371,136 @@
       </w:rPr>
     </w:lvl>
   </w:abstractNum>
-  <w:abstractNum w:abstractNumId="7" w15:restartNumberingAfterBreak="0">
+  <w:abstractNum w:abstractNumId="8" w15:restartNumberingAfterBreak="0">
+    <w:nsid w:val="6E7A0BAB"/>
+    <w:multiLevelType w:val="multilevel"/>
+    <w:tmpl w:val="E5442186"/>
+    <w:lvl w:ilvl="0">
+      <w:start w:val="1"/>
+      <w:numFmt w:val="decimal"/>
+      <w:lvlText w:val="%1."/>
+      <w:lvlJc w:val="left"/>
+      <w:pPr>
+        <w:ind w:left="720" w:hanging="360"/>
+      </w:pPr>
+      <w:rPr>
+        <w:rFonts w:hint="default"/>
+      </w:rPr>
+    </w:lvl>
+    <w:lvl w:ilvl="1">
+      <w:start w:val="1"/>
+      <w:numFmt w:val="decimal"/>
+      <w:isLgl/>
+      <w:lvlText w:val="%1.%2."/>
+      <w:lvlJc w:val="left"/>
+      <w:pPr>
+        <w:ind w:left="1080" w:hanging="720"/>
+      </w:pPr>
+      <w:rPr>
+        <w:rFonts w:hint="default"/>
+        <w:sz w:val="28"/>
+      </w:rPr>
+    </w:lvl>
+    <w:lvl w:ilvl="2">
+      <w:start w:val="1"/>
+      <w:numFmt w:val="decimal"/>
+      <w:isLgl/>
+      <w:lvlText w:val="%1.%2.%3."/>
+      <w:lvlJc w:val="left"/>
+      <w:pPr>
+        <w:ind w:left="1440" w:hanging="1080"/>
+      </w:pPr>
+      <w:rPr>
+        <w:rFonts w:hint="default"/>
+        <w:sz w:val="28"/>
+      </w:rPr>
+    </w:lvl>
+    <w:lvl w:ilvl="3">
+      <w:start w:val="1"/>
+      <w:numFmt w:val="decimal"/>
+      <w:isLgl/>
+      <w:lvlText w:val="%1.%2.%3.%4."/>
+      <w:lvlJc w:val="left"/>
+      <w:pPr>
+        <w:ind w:left="1440" w:hanging="1080"/>
+      </w:pPr>
+      <w:rPr>
+        <w:rFonts w:hint="default"/>
+        <w:sz w:val="28"/>
+      </w:rPr>
+    </w:lvl>
+    <w:lvl w:ilvl="4">
+      <w:start w:val="1"/>
+      <w:numFmt w:val="decimal"/>
+      <w:isLgl/>
+      <w:lvlText w:val="%1.%2.%3.%4.%5."/>
+      <w:lvlJc w:val="left"/>
+      <w:pPr>
+        <w:ind w:left="1800" w:hanging="1440"/>
+      </w:pPr>
+      <w:rPr>
+        <w:rFonts w:hint="default"/>
+        <w:sz w:val="28"/>
+      </w:rPr>
+    </w:lvl>
+    <w:lvl w:ilvl="5">
+      <w:start w:val="1"/>
+      <w:numFmt w:val="decimal"/>
+      <w:isLgl/>
+      <w:lvlText w:val="%1.%2.%3.%4.%5.%6."/>
+      <w:lvlJc w:val="left"/>
+      <w:pPr>
+        <w:ind w:left="2160" w:hanging="1800"/>
+      </w:pPr>
+      <w:rPr>
+        <w:rFonts w:hint="default"/>
+        <w:sz w:val="28"/>
+      </w:rPr>
+    </w:lvl>
+    <w:lvl w:ilvl="6">
+      <w:start w:val="1"/>
+      <w:numFmt w:val="decimal"/>
+      <w:isLgl/>
+      <w:lvlText w:val="%1.%2.%3.%4.%5.%6.%7."/>
+      <w:lvlJc w:val="left"/>
+      <w:pPr>
+        <w:ind w:left="2520" w:hanging="2160"/>
+      </w:pPr>
+      <w:rPr>
+        <w:rFonts w:hint="default"/>
+        <w:sz w:val="28"/>
+      </w:rPr>
+    </w:lvl>
+    <w:lvl w:ilvl="7">
+      <w:start w:val="1"/>
+      <w:numFmt w:val="decimal"/>
+      <w:isLgl/>
+      <w:lvlText w:val="%1.%2.%3.%4.%5.%6.%7.%8."/>
+      <w:lvlJc w:val="left"/>
+      <w:pPr>
+        <w:ind w:left="2520" w:hanging="2160"/>
+      </w:pPr>
+      <w:rPr>
+        <w:rFonts w:hint="default"/>
+        <w:sz w:val="28"/>
+      </w:rPr>
+    </w:lvl>
+    <w:lvl w:ilvl="8">
+      <w:start w:val="1"/>
+      <w:numFmt w:val="decimal"/>
+      <w:isLgl/>
+      <w:lvlText w:val="%1.%2.%3.%4.%5.%6.%7.%8.%9."/>
+      <w:lvlJc w:val="left"/>
+      <w:pPr>
+        <w:ind w:left="2880" w:hanging="2520"/>
+      </w:pPr>
+      <w:rPr>
+        <w:rFonts w:hint="default"/>
+        <w:sz w:val="28"/>
+      </w:rPr>
+    </w:lvl>
+  </w:abstractNum>
+  <w:abstractNum w:abstractNumId="9" w15:restartNumberingAfterBreak="0">
     <w:nsid w:val="73A266F8"/>
     <w:multiLevelType w:val="multilevel"/>
     <w:tmpl w:val="F0E63B48"/>
@@ -2508,25 +3617,31 @@
     <w:abstractNumId w:val="0"/>
   </w:num>
   <w:num w:numId="2" w16cid:durableId="2108848031">
-    <w:abstractNumId w:val="3"/>
+    <w:abstractNumId w:val="4"/>
   </w:num>
   <w:num w:numId="3" w16cid:durableId="1354727092">
-    <w:abstractNumId w:val="5"/>
+    <w:abstractNumId w:val="6"/>
   </w:num>
   <w:num w:numId="4" w16cid:durableId="334501388">
     <w:abstractNumId w:val="1"/>
   </w:num>
   <w:num w:numId="5" w16cid:durableId="1596476156">
-    <w:abstractNumId w:val="6"/>
+    <w:abstractNumId w:val="7"/>
   </w:num>
   <w:num w:numId="6" w16cid:durableId="1138719581">
+    <w:abstractNumId w:val="3"/>
+  </w:num>
+  <w:num w:numId="7" w16cid:durableId="1416824206">
+    <w:abstractNumId w:val="9"/>
+  </w:num>
+  <w:num w:numId="8" w16cid:durableId="1500271801">
+    <w:abstractNumId w:val="5"/>
+  </w:num>
+  <w:num w:numId="9" w16cid:durableId="644579059">
     <w:abstractNumId w:val="2"/>
   </w:num>
-  <w:num w:numId="7" w16cid:durableId="1416824206">
-    <w:abstractNumId w:val="7"/>
-  </w:num>
-  <w:num w:numId="8" w16cid:durableId="1500271801">
-    <w:abstractNumId w:val="4"/>
+  <w:num w:numId="10" w16cid:durableId="326632397">
+    <w:abstractNumId w:val="8"/>
   </w:num>
 </w:numbering>
 </file>
@@ -3317,6 +4432,82 @@
       <w:contextualSpacing/>
     </w:pPr>
   </w:style>
+  <w:style w:type="character" w:styleId="UnresolvedMention">
+    <w:name w:val="Unresolved Mention"/>
+    <w:basedOn w:val="DefaultParagraphFont"/>
+    <w:uiPriority w:val="99"/>
+    <w:semiHidden/>
+    <w:unhideWhenUsed/>
+    <w:rsid w:val="00F5724D"/>
+    <w:rPr>
+      <w:color w:val="605E5C"/>
+      <w:shd w:val="clear" w:color="auto" w:fill="E1DFDD"/>
+    </w:rPr>
+  </w:style>
+  <w:style w:type="character" w:styleId="FollowedHyperlink">
+    <w:name w:val="FollowedHyperlink"/>
+    <w:basedOn w:val="DefaultParagraphFont"/>
+    <w:uiPriority w:val="99"/>
+    <w:semiHidden/>
+    <w:unhideWhenUsed/>
+    <w:rsid w:val="00F5724D"/>
+    <w:rPr>
+      <w:color w:val="954F72" w:themeColor="followedHyperlink"/>
+      <w:u w:val="single"/>
+    </w:rPr>
+  </w:style>
+  <w:style w:type="paragraph" w:customStyle="1" w:styleId="pdq2pgselectionanchorcontainer">
+    <w:name w:val="pdq2pg_selectionanchorcontainer"/>
+    <w:basedOn w:val="Normal"/>
+    <w:rsid w:val="00731D4F"/>
+    <w:pPr>
+      <w:spacing w:before="100" w:beforeAutospacing="1" w:after="100" w:afterAutospacing="1" w:line="240" w:lineRule="auto"/>
+    </w:pPr>
+    <w:rPr>
+      <w:rFonts w:ascii="Times New Roman" w:eastAsia="Times New Roman" w:hAnsi="Times New Roman"/>
+      <w:sz w:val="24"/>
+      <w:szCs w:val="24"/>
+    </w:rPr>
+  </w:style>
+  <w:style w:type="paragraph" w:styleId="NormalWeb">
+    <w:name w:val="Normal (Web)"/>
+    <w:basedOn w:val="Normal"/>
+    <w:uiPriority w:val="99"/>
+    <w:unhideWhenUsed/>
+    <w:rsid w:val="00731D4F"/>
+    <w:pPr>
+      <w:spacing w:before="100" w:beforeAutospacing="1" w:after="100" w:afterAutospacing="1" w:line="240" w:lineRule="auto"/>
+    </w:pPr>
+    <w:rPr>
+      <w:rFonts w:ascii="Times New Roman" w:eastAsia="Times New Roman" w:hAnsi="Times New Roman"/>
+      <w:sz w:val="24"/>
+      <w:szCs w:val="24"/>
+    </w:rPr>
+  </w:style>
+  <w:style w:type="character" w:styleId="Strong">
+    <w:name w:val="Strong"/>
+    <w:basedOn w:val="DefaultParagraphFont"/>
+    <w:uiPriority w:val="22"/>
+    <w:qFormat/>
+    <w:rsid w:val="009976AB"/>
+    <w:rPr>
+      <w:b/>
+      <w:bCs/>
+    </w:rPr>
+  </w:style>
+  <w:style w:type="character" w:styleId="HTMLCode">
+    <w:name w:val="HTML Code"/>
+    <w:basedOn w:val="DefaultParagraphFont"/>
+    <w:uiPriority w:val="99"/>
+    <w:semiHidden/>
+    <w:unhideWhenUsed/>
+    <w:rsid w:val="00362DAD"/>
+    <w:rPr>
+      <w:rFonts w:ascii="Courier New" w:eastAsia="Times New Roman" w:hAnsi="Courier New" w:cs="Courier New"/>
+      <w:sz w:val="20"/>
+      <w:szCs w:val="20"/>
+    </w:rPr>
+  </w:style>
 </w:styles>
 </file>
 

</xml_diff>

<commit_message>
Task 2 is completed
</commit_message>
<xml_diff>
--- a/report/Large_Scale_E_commerce_Behaviour_Analysis_Report.docx
+++ b/report/Large_Scale_E_commerce_Behaviour_Analysis_Report.docx
@@ -1718,6 +1718,152 @@
       </w:r>
     </w:p>
     <w:p>
+      <w:r>
+        <w:t xml:space="preserve">In this project, a Hadoop environment was established on Docker to store and process the large dataset. In the Hadoop environment, </w:t>
+      </w:r>
+      <w:r>
+        <w:rPr>
+          <w:b/>
+          <w:bCs/>
+        </w:rPr>
+        <w:t>HDFS</w:t>
+      </w:r>
+      <w:r>
+        <w:t xml:space="preserve"> was used for data storage, while </w:t>
+      </w:r>
+      <w:r>
+        <w:rPr>
+          <w:b/>
+          <w:bCs/>
+        </w:rPr>
+        <w:t>YARN</w:t>
+      </w:r>
+      <w:r>
+        <w:t xml:space="preserve"> was used for resource management and distributed process management. </w:t>
+      </w:r>
+      <w:proofErr w:type="spellStart"/>
+      <w:r>
+        <w:rPr>
+          <w:b/>
+          <w:bCs/>
+        </w:rPr>
+        <w:t>NameNode</w:t>
+      </w:r>
+      <w:proofErr w:type="spellEnd"/>
+      <w:r>
+        <w:t xml:space="preserve"> was used to manage the metadata of files and blocks in HDFS, while </w:t>
+      </w:r>
+      <w:proofErr w:type="spellStart"/>
+      <w:r>
+        <w:rPr>
+          <w:b/>
+          <w:bCs/>
+        </w:rPr>
+        <w:t>DataNode</w:t>
+      </w:r>
+      <w:proofErr w:type="spellEnd"/>
+      <w:r>
+        <w:t xml:space="preserve"> was used to store the data physically. Within YARN, </w:t>
+      </w:r>
+      <w:proofErr w:type="spellStart"/>
+      <w:r>
+        <w:rPr>
+          <w:b/>
+          <w:bCs/>
+        </w:rPr>
+        <w:t>ResourceManager</w:t>
+      </w:r>
+      <w:proofErr w:type="spellEnd"/>
+      <w:r>
+        <w:t xml:space="preserve"> manages the resources, while </w:t>
+      </w:r>
+      <w:proofErr w:type="spellStart"/>
+      <w:r>
+        <w:rPr>
+          <w:b/>
+          <w:bCs/>
+        </w:rPr>
+        <w:t>NodeManager</w:t>
+      </w:r>
+      <w:proofErr w:type="spellEnd"/>
+      <w:r>
+        <w:t xml:space="preserve"> monitors running processes and resources.</w:t>
+      </w:r>
+    </w:p>
+    <w:p>
+      <w:pPr>
+        <w:jc w:val="center"/>
+      </w:pPr>
+      <w:r>
+        <w:rPr>
+          <w:noProof/>
+        </w:rPr>
+        <w:drawing>
+          <wp:inline distT="0" distB="0" distL="0" distR="0" wp14:anchorId="68E79E2D" wp14:editId="0CF694B6">
+            <wp:extent cx="5943600" cy="1677035"/>
+            <wp:effectExtent l="0" t="0" r="0" b="0"/>
+            <wp:docPr id="916010322" name="Picture 5"/>
+            <wp:cNvGraphicFramePr>
+              <a:graphicFrameLocks xmlns:a="http://schemas.openxmlformats.org/drawingml/2006/main" noChangeAspect="1"/>
+            </wp:cNvGraphicFramePr>
+            <a:graphic xmlns:a="http://schemas.openxmlformats.org/drawingml/2006/main">
+              <a:graphicData uri="http://schemas.openxmlformats.org/drawingml/2006/picture">
+                <pic:pic xmlns:pic="http://schemas.openxmlformats.org/drawingml/2006/picture">
+                  <pic:nvPicPr>
+                    <pic:cNvPr id="0" name="Picture 5"/>
+                    <pic:cNvPicPr>
+                      <a:picLocks noChangeAspect="1" noChangeArrowheads="1"/>
+                    </pic:cNvPicPr>
+                  </pic:nvPicPr>
+                  <pic:blipFill>
+                    <a:blip r:embed="rId13">
+                      <a:extLst>
+                        <a:ext uri="{28A0092B-C50C-407E-A947-70E740481C1C}">
+                          <a14:useLocalDpi xmlns:a14="http://schemas.microsoft.com/office/drawing/2010/main" val="0"/>
+                        </a:ext>
+                      </a:extLst>
+                    </a:blip>
+                    <a:srcRect/>
+                    <a:stretch>
+                      <a:fillRect/>
+                    </a:stretch>
+                  </pic:blipFill>
+                  <pic:spPr bwMode="auto">
+                    <a:xfrm>
+                      <a:off x="0" y="0"/>
+                      <a:ext cx="5943600" cy="1677035"/>
+                    </a:xfrm>
+                    <a:prstGeom prst="rect">
+                      <a:avLst/>
+                    </a:prstGeom>
+                    <a:noFill/>
+                    <a:ln>
+                      <a:noFill/>
+                    </a:ln>
+                  </pic:spPr>
+                </pic:pic>
+              </a:graphicData>
+            </a:graphic>
+          </wp:inline>
+        </w:drawing>
+      </w:r>
+    </w:p>
+    <w:p>
+      <w:pPr>
+        <w:jc w:val="center"/>
+      </w:pPr>
+      <w:r>
+        <w:rPr>
+          <w:b/>
+          <w:bCs/>
+        </w:rPr>
+        <w:t>Figure 5.</w:t>
+      </w:r>
+      <w:r>
+        <w:t xml:space="preserve"> Hadoop Docker containers</w:t>
+      </w:r>
+    </w:p>
+    <w:p>
       <w:pPr>
         <w:pStyle w:val="Heading2"/>
         <w:numPr>
@@ -1730,6 +1876,114 @@
       </w:r>
     </w:p>
     <w:p>
+      <w:r>
+        <w:t xml:space="preserve">HDFS is a file system in the Hadoop environment that enables large amounts of data to be stored in a distributed way. In this project, the </w:t>
+      </w:r>
+      <w:r>
+        <w:rPr>
+          <w:b/>
+          <w:bCs/>
+        </w:rPr>
+        <w:t>5.67 GB 2019-Oct.csv dataset</w:t>
+      </w:r>
+      <w:r>
+        <w:t xml:space="preserve"> was uploaded to HDFS.</w:t>
+      </w:r>
+    </w:p>
+    <w:p>
+      <w:pPr>
+        <w:jc w:val="center"/>
+      </w:pPr>
+      <w:r>
+        <w:rPr>
+          <w:noProof/>
+        </w:rPr>
+        <w:lastRenderedPageBreak/>
+        <w:drawing>
+          <wp:inline distT="0" distB="0" distL="0" distR="0" wp14:anchorId="0016550F" wp14:editId="63728549">
+            <wp:extent cx="5943600" cy="4208780"/>
+            <wp:effectExtent l="0" t="0" r="0" b="1270"/>
+            <wp:docPr id="15208606" name="Picture 6"/>
+            <wp:cNvGraphicFramePr>
+              <a:graphicFrameLocks xmlns:a="http://schemas.openxmlformats.org/drawingml/2006/main" noChangeAspect="1"/>
+            </wp:cNvGraphicFramePr>
+            <a:graphic xmlns:a="http://schemas.openxmlformats.org/drawingml/2006/main">
+              <a:graphicData uri="http://schemas.openxmlformats.org/drawingml/2006/picture">
+                <pic:pic xmlns:pic="http://schemas.openxmlformats.org/drawingml/2006/picture">
+                  <pic:nvPicPr>
+                    <pic:cNvPr id="0" name="Picture 7"/>
+                    <pic:cNvPicPr>
+                      <a:picLocks noChangeAspect="1" noChangeArrowheads="1"/>
+                    </pic:cNvPicPr>
+                  </pic:nvPicPr>
+                  <pic:blipFill>
+                    <a:blip r:embed="rId14">
+                      <a:extLst>
+                        <a:ext uri="{28A0092B-C50C-407E-A947-70E740481C1C}">
+                          <a14:useLocalDpi xmlns:a14="http://schemas.microsoft.com/office/drawing/2010/main" val="0"/>
+                        </a:ext>
+                      </a:extLst>
+                    </a:blip>
+                    <a:srcRect/>
+                    <a:stretch>
+                      <a:fillRect/>
+                    </a:stretch>
+                  </pic:blipFill>
+                  <pic:spPr bwMode="auto">
+                    <a:xfrm>
+                      <a:off x="0" y="0"/>
+                      <a:ext cx="5943600" cy="4208780"/>
+                    </a:xfrm>
+                    <a:prstGeom prst="rect">
+                      <a:avLst/>
+                    </a:prstGeom>
+                    <a:noFill/>
+                    <a:ln>
+                      <a:noFill/>
+                    </a:ln>
+                  </pic:spPr>
+                </pic:pic>
+              </a:graphicData>
+            </a:graphic>
+          </wp:inline>
+        </w:drawing>
+      </w:r>
+    </w:p>
+    <w:p>
+      <w:pPr>
+        <w:jc w:val="center"/>
+      </w:pPr>
+      <w:r>
+        <w:rPr>
+          <w:b/>
+          <w:bCs/>
+        </w:rPr>
+        <w:t>Figure 6.</w:t>
+      </w:r>
+      <w:r>
+        <w:t xml:space="preserve"> Dataset uploaded to HDFS</w:t>
+      </w:r>
+    </w:p>
+    <w:p>
+      <w:r>
+        <w:t xml:space="preserve">The dataset was stored under the </w:t>
+      </w:r>
+      <w:r>
+        <w:t>/ecommerce/input/2019-Oct.csv</w:t>
+      </w:r>
+      <w:r>
+        <w:t xml:space="preserve"> path and was divided into blocks by HDFS and stored on the </w:t>
+      </w:r>
+      <w:proofErr w:type="spellStart"/>
+      <w:r>
+        <w:t>DataNode</w:t>
+      </w:r>
+      <w:proofErr w:type="spellEnd"/>
+      <w:r>
+        <w:t>.</w:t>
+      </w:r>
+    </w:p>
+    <w:p>
       <w:pPr>
         <w:pStyle w:val="Heading2"/>
         <w:numPr>
@@ -1742,6 +1996,162 @@
       </w:r>
     </w:p>
     <w:p>
+      <w:r>
+        <w:t xml:space="preserve">The dataset was uploaded to HDFS using the HDFS command line. First, the /ecommerce/input directory was created using the </w:t>
+      </w:r>
+      <w:proofErr w:type="spellStart"/>
+      <w:r>
+        <w:t>hdfs</w:t>
+      </w:r>
+      <w:proofErr w:type="spellEnd"/>
+      <w:r>
+        <w:t xml:space="preserve"> </w:t>
+      </w:r>
+      <w:proofErr w:type="spellStart"/>
+      <w:r>
+        <w:t>dfs</w:t>
+      </w:r>
+      <w:proofErr w:type="spellEnd"/>
+      <w:r>
+        <w:t xml:space="preserve"> -</w:t>
+      </w:r>
+      <w:proofErr w:type="spellStart"/>
+      <w:r>
+        <w:t>mkdir</w:t>
+      </w:r>
+      <w:proofErr w:type="spellEnd"/>
+      <w:r>
+        <w:t xml:space="preserve"> command. The 2019-Oct.csv file was then uploaded using the </w:t>
+      </w:r>
+      <w:proofErr w:type="spellStart"/>
+      <w:r>
+        <w:t>hdfs</w:t>
+      </w:r>
+      <w:proofErr w:type="spellEnd"/>
+      <w:r>
+        <w:t xml:space="preserve"> </w:t>
+      </w:r>
+      <w:proofErr w:type="spellStart"/>
+      <w:r>
+        <w:t>dfs</w:t>
+      </w:r>
+      <w:proofErr w:type="spellEnd"/>
+      <w:r>
+        <w:t xml:space="preserve"> -put command. After the upload, the </w:t>
+      </w:r>
+      <w:proofErr w:type="spellStart"/>
+      <w:r>
+        <w:t>hdfs</w:t>
+      </w:r>
+      <w:proofErr w:type="spellEnd"/>
+      <w:r>
+        <w:t xml:space="preserve"> </w:t>
+      </w:r>
+      <w:proofErr w:type="spellStart"/>
+      <w:r>
+        <w:t>dfs</w:t>
+      </w:r>
+      <w:proofErr w:type="spellEnd"/>
+      <w:r>
+        <w:t xml:space="preserve"> -ls command was used to verify that the file was successfully stored in HDFS. The file was displayed with a size of approximately 5.3 GB.</w:t>
+      </w:r>
+    </w:p>
+    <w:p>
+      <w:pPr>
+        <w:jc w:val="center"/>
+      </w:pPr>
+      <w:r>
+        <w:rPr>
+          <w:noProof/>
+        </w:rPr>
+        <w:lastRenderedPageBreak/>
+        <w:drawing>
+          <wp:inline distT="0" distB="0" distL="0" distR="0" wp14:anchorId="5CDDFC74" wp14:editId="420B5247">
+            <wp:extent cx="5943600" cy="4914900"/>
+            <wp:effectExtent l="0" t="0" r="0" b="0"/>
+            <wp:docPr id="1957829284" name="Picture 7"/>
+            <wp:cNvGraphicFramePr>
+              <a:graphicFrameLocks xmlns:a="http://schemas.openxmlformats.org/drawingml/2006/main" noChangeAspect="1"/>
+            </wp:cNvGraphicFramePr>
+            <a:graphic xmlns:a="http://schemas.openxmlformats.org/drawingml/2006/main">
+              <a:graphicData uri="http://schemas.openxmlformats.org/drawingml/2006/picture">
+                <pic:pic xmlns:pic="http://schemas.openxmlformats.org/drawingml/2006/picture">
+                  <pic:nvPicPr>
+                    <pic:cNvPr id="0" name="Picture 9"/>
+                    <pic:cNvPicPr>
+                      <a:picLocks noChangeAspect="1" noChangeArrowheads="1"/>
+                    </pic:cNvPicPr>
+                  </pic:nvPicPr>
+                  <pic:blipFill>
+                    <a:blip r:embed="rId15">
+                      <a:extLst>
+                        <a:ext uri="{28A0092B-C50C-407E-A947-70E740481C1C}">
+                          <a14:useLocalDpi xmlns:a14="http://schemas.microsoft.com/office/drawing/2010/main" val="0"/>
+                        </a:ext>
+                      </a:extLst>
+                    </a:blip>
+                    <a:srcRect/>
+                    <a:stretch>
+                      <a:fillRect/>
+                    </a:stretch>
+                  </pic:blipFill>
+                  <pic:spPr bwMode="auto">
+                    <a:xfrm>
+                      <a:off x="0" y="0"/>
+                      <a:ext cx="5943600" cy="4914900"/>
+                    </a:xfrm>
+                    <a:prstGeom prst="rect">
+                      <a:avLst/>
+                    </a:prstGeom>
+                    <a:noFill/>
+                    <a:ln>
+                      <a:noFill/>
+                    </a:ln>
+                  </pic:spPr>
+                </pic:pic>
+              </a:graphicData>
+            </a:graphic>
+          </wp:inline>
+        </w:drawing>
+      </w:r>
+    </w:p>
+    <w:p>
+      <w:pPr>
+        <w:jc w:val="center"/>
+      </w:pPr>
+      <w:r>
+        <w:rPr>
+          <w:b/>
+          <w:bCs/>
+        </w:rPr>
+        <w:t>Figure 7.</w:t>
+      </w:r>
+      <w:r>
+        <w:t xml:space="preserve"> HDFS </w:t>
+      </w:r>
+      <w:proofErr w:type="spellStart"/>
+      <w:r>
+        <w:t>DataNode</w:t>
+      </w:r>
+      <w:proofErr w:type="spellEnd"/>
+      <w:r>
+        <w:t xml:space="preserve"> and storage status</w:t>
+      </w:r>
+    </w:p>
+    <w:p>
+      <w:r>
+        <w:t xml:space="preserve">The HDFS report showed one live </w:t>
+      </w:r>
+      <w:proofErr w:type="spellStart"/>
+      <w:r>
+        <w:t>DataNode</w:t>
+      </w:r>
+      <w:proofErr w:type="spellEnd"/>
+      <w:r>
+        <w:t xml:space="preserve"> with normal status, confirming that the storage node was available for the dataset.</w:t>
+      </w:r>
+    </w:p>
+    <w:p>
       <w:pPr>
         <w:pStyle w:val="Heading2"/>
         <w:numPr>
@@ -1754,6 +2164,106 @@
       </w:r>
     </w:p>
     <w:p>
+      <w:r>
+        <w:t xml:space="preserve">YARN is a resource management system that enables resource management and the execution of distributed processes in the Hadoop environment. In this project, the </w:t>
+      </w:r>
+      <w:proofErr w:type="spellStart"/>
+      <w:r>
+        <w:t>ResourceManager</w:t>
+      </w:r>
+      <w:proofErr w:type="spellEnd"/>
+      <w:r>
+        <w:t xml:space="preserve"> was used to manage cluster resources and control the resource requirements of processes, while the </w:t>
+      </w:r>
+      <w:proofErr w:type="spellStart"/>
+      <w:r>
+        <w:t>NodeManager</w:t>
+      </w:r>
+      <w:proofErr w:type="spellEnd"/>
+      <w:r>
+        <w:t xml:space="preserve"> was used to monitor running processes and resource usage in order to manage distributed data processing operations performed on Hadoop.</w:t>
+      </w:r>
+    </w:p>
+    <w:p>
+      <w:pPr>
+        <w:jc w:val="center"/>
+      </w:pPr>
+      <w:r>
+        <w:rPr>
+          <w:noProof/>
+        </w:rPr>
+        <w:lastRenderedPageBreak/>
+        <w:drawing>
+          <wp:inline distT="0" distB="0" distL="0" distR="0" wp14:anchorId="07B1B302" wp14:editId="77647C87">
+            <wp:extent cx="5937250" cy="1943100"/>
+            <wp:effectExtent l="0" t="0" r="6350" b="0"/>
+            <wp:docPr id="1379434909" name="Picture 8"/>
+            <wp:cNvGraphicFramePr>
+              <a:graphicFrameLocks xmlns:a="http://schemas.openxmlformats.org/drawingml/2006/main" noChangeAspect="1"/>
+            </wp:cNvGraphicFramePr>
+            <a:graphic xmlns:a="http://schemas.openxmlformats.org/drawingml/2006/main">
+              <a:graphicData uri="http://schemas.openxmlformats.org/drawingml/2006/picture">
+                <pic:pic xmlns:pic="http://schemas.openxmlformats.org/drawingml/2006/picture">
+                  <pic:nvPicPr>
+                    <pic:cNvPr id="0" name="Picture 10"/>
+                    <pic:cNvPicPr>
+                      <a:picLocks noChangeAspect="1" noChangeArrowheads="1"/>
+                    </pic:cNvPicPr>
+                  </pic:nvPicPr>
+                  <pic:blipFill>
+                    <a:blip r:embed="rId16" cstate="hqprint">
+                      <a:extLst>
+                        <a:ext uri="{28A0092B-C50C-407E-A947-70E740481C1C}">
+                          <a14:useLocalDpi xmlns:a14="http://schemas.microsoft.com/office/drawing/2010/main" val="0"/>
+                        </a:ext>
+                      </a:extLst>
+                    </a:blip>
+                    <a:srcRect/>
+                    <a:stretch>
+                      <a:fillRect/>
+                    </a:stretch>
+                  </pic:blipFill>
+                  <pic:spPr bwMode="auto">
+                    <a:xfrm>
+                      <a:off x="0" y="0"/>
+                      <a:ext cx="5937250" cy="1943100"/>
+                    </a:xfrm>
+                    <a:prstGeom prst="rect">
+                      <a:avLst/>
+                    </a:prstGeom>
+                    <a:noFill/>
+                    <a:ln>
+                      <a:noFill/>
+                    </a:ln>
+                  </pic:spPr>
+                </pic:pic>
+              </a:graphicData>
+            </a:graphic>
+          </wp:inline>
+        </w:drawing>
+      </w:r>
+    </w:p>
+    <w:p>
+      <w:pPr>
+        <w:jc w:val="center"/>
+      </w:pPr>
+      <w:r>
+        <w:rPr>
+          <w:b/>
+          <w:bCs/>
+        </w:rPr>
+        <w:t>Figure 8.</w:t>
+      </w:r>
+      <w:r>
+        <w:t xml:space="preserve"> YARN </w:t>
+      </w:r>
+      <w:proofErr w:type="spellStart"/>
+      <w:r>
+        <w:t>ResourceManager</w:t>
+      </w:r>
+      <w:proofErr w:type="spellEnd"/>
+    </w:p>
+    <w:p>
       <w:pPr>
         <w:pStyle w:val="Heading2"/>
         <w:numPr>
@@ -1766,6 +2276,173 @@
       </w:r>
     </w:p>
     <w:p>
+      <w:r>
+        <w:t>In this project, the 5.67 GB 2019-Oct.csv was a very large data file, so it was divided into 43 blocks by HDFS. The necessary checks were performed, and it was concluded that there were no missing or corrupted blocks in the file. In the configuration used, the replication factor was set to 1. Therefore, there was only one copy of each block.</w:t>
+      </w:r>
+    </w:p>
+    <w:p>
+      <w:pPr>
+        <w:jc w:val="center"/>
+      </w:pPr>
+      <w:r>
+        <w:rPr>
+          <w:noProof/>
+        </w:rPr>
+        <w:lastRenderedPageBreak/>
+        <w:drawing>
+          <wp:inline distT="0" distB="0" distL="0" distR="0" wp14:anchorId="6839F889" wp14:editId="6717140C">
+            <wp:extent cx="4643692" cy="4946650"/>
+            <wp:effectExtent l="0" t="0" r="5080" b="6350"/>
+            <wp:docPr id="1111699845" name="Picture 10"/>
+            <wp:cNvGraphicFramePr>
+              <a:graphicFrameLocks xmlns:a="http://schemas.openxmlformats.org/drawingml/2006/main" noChangeAspect="1"/>
+            </wp:cNvGraphicFramePr>
+            <a:graphic xmlns:a="http://schemas.openxmlformats.org/drawingml/2006/main">
+              <a:graphicData uri="http://schemas.openxmlformats.org/drawingml/2006/picture">
+                <pic:pic xmlns:pic="http://schemas.openxmlformats.org/drawingml/2006/picture">
+                  <pic:nvPicPr>
+                    <pic:cNvPr id="0" name="Picture 12"/>
+                    <pic:cNvPicPr>
+                      <a:picLocks noChangeAspect="1" noChangeArrowheads="1"/>
+                    </pic:cNvPicPr>
+                  </pic:nvPicPr>
+                  <pic:blipFill>
+                    <a:blip r:embed="rId17">
+                      <a:extLst>
+                        <a:ext uri="{28A0092B-C50C-407E-A947-70E740481C1C}">
+                          <a14:useLocalDpi xmlns:a14="http://schemas.microsoft.com/office/drawing/2010/main" val="0"/>
+                        </a:ext>
+                      </a:extLst>
+                    </a:blip>
+                    <a:srcRect/>
+                    <a:stretch>
+                      <a:fillRect/>
+                    </a:stretch>
+                  </pic:blipFill>
+                  <pic:spPr bwMode="auto">
+                    <a:xfrm>
+                      <a:off x="0" y="0"/>
+                      <a:ext cx="4653447" cy="4957042"/>
+                    </a:xfrm>
+                    <a:prstGeom prst="rect">
+                      <a:avLst/>
+                    </a:prstGeom>
+                    <a:noFill/>
+                    <a:ln>
+                      <a:noFill/>
+                    </a:ln>
+                  </pic:spPr>
+                </pic:pic>
+              </a:graphicData>
+            </a:graphic>
+          </wp:inline>
+        </w:drawing>
+      </w:r>
+    </w:p>
+    <w:p>
+      <w:pPr>
+        <w:jc w:val="center"/>
+      </w:pPr>
+      <w:r>
+        <w:rPr>
+          <w:b/>
+          <w:bCs/>
+        </w:rPr>
+        <w:t>Figure 9.</w:t>
+      </w:r>
+      <w:r>
+        <w:t xml:space="preserve"> HDFS blocks, replication and file system health</w:t>
+      </w:r>
+    </w:p>
+    <w:p>
+      <w:r>
+        <w:t xml:space="preserve">In HDFS, </w:t>
+      </w:r>
+      <w:proofErr w:type="spellStart"/>
+      <w:r>
+        <w:rPr>
+          <w:b/>
+          <w:bCs/>
+        </w:rPr>
+        <w:t>FSImage</w:t>
+      </w:r>
+      <w:proofErr w:type="spellEnd"/>
+      <w:r>
+        <w:t xml:space="preserve"> represents the image in which the current metadata information about the file system is stored, while </w:t>
+      </w:r>
+      <w:proofErr w:type="spellStart"/>
+      <w:r>
+        <w:rPr>
+          <w:b/>
+          <w:bCs/>
+        </w:rPr>
+        <w:t>EditLog</w:t>
+      </w:r>
+      <w:proofErr w:type="spellEnd"/>
+      <w:r>
+        <w:t xml:space="preserve"> records the changes made to the file system. The </w:t>
+      </w:r>
+      <w:r>
+        <w:rPr>
+          <w:b/>
+          <w:bCs/>
+        </w:rPr>
+        <w:t>checkpointing</w:t>
+      </w:r>
+      <w:r>
+        <w:t xml:space="preserve"> process allows the changes in the </w:t>
+      </w:r>
+      <w:proofErr w:type="spellStart"/>
+      <w:r>
+        <w:t>EditLog</w:t>
+      </w:r>
+      <w:proofErr w:type="spellEnd"/>
+      <w:r>
+        <w:t xml:space="preserve"> to be merged with the </w:t>
+      </w:r>
+      <w:proofErr w:type="spellStart"/>
+      <w:r>
+        <w:t>FSImage</w:t>
+      </w:r>
+      <w:proofErr w:type="spellEnd"/>
+      <w:r>
+        <w:t xml:space="preserve"> to create an updated file system image. This process helps metadata management on the </w:t>
+      </w:r>
+      <w:proofErr w:type="spellStart"/>
+      <w:r>
+        <w:t>NameNode</w:t>
+      </w:r>
+      <w:proofErr w:type="spellEnd"/>
+      <w:r>
+        <w:t xml:space="preserve"> to be performed in a more </w:t>
+      </w:r>
+      <w:r>
+        <w:t>organized</w:t>
+      </w:r>
+      <w:r>
+        <w:t xml:space="preserve"> way. Since the provided Docker configuration did not include a separate </w:t>
+      </w:r>
+      <w:r>
+        <w:rPr>
+          <w:b/>
+          <w:bCs/>
+        </w:rPr>
+        <w:t xml:space="preserve">Secondary </w:t>
+      </w:r>
+      <w:proofErr w:type="spellStart"/>
+      <w:r>
+        <w:rPr>
+          <w:b/>
+          <w:bCs/>
+        </w:rPr>
+        <w:t>NameNode</w:t>
+      </w:r>
+      <w:proofErr w:type="spellEnd"/>
+      <w:r>
+        <w:t xml:space="preserve"> service, this component was not run as a separate container in practice, and its role and the checkpointing mechanism were considered theoretically.</w:t>
+      </w:r>
+    </w:p>
+    <w:p>
       <w:pPr>
         <w:pStyle w:val="Heading2"/>
         <w:numPr>
@@ -1777,20 +2454,47 @@
         <w:t>Implementation Issues and Limitations</w:t>
       </w:r>
     </w:p>
-    <w:p/>
-    <w:p/>
-    <w:p/>
-    <w:p/>
-    <w:p/>
-    <w:p/>
-    <w:p/>
-    <w:p/>
-    <w:p/>
-    <w:p/>
-    <w:p/>
-    <w:p/>
-    <w:p/>
-    <w:p/>
+    <w:p>
+      <w:r>
+        <w:t xml:space="preserve">During the setup of the Hadoop environment and the data processing stage, it was identified that Python was not available inside the Hadoop container. Therefore, shell scripts were used instead of Python for the MapReduce operations. Since the Hadoop environment used one </w:t>
+      </w:r>
+      <w:proofErr w:type="spellStart"/>
+      <w:r>
+        <w:t>DataNode</w:t>
+      </w:r>
+      <w:proofErr w:type="spellEnd"/>
+      <w:r>
+        <w:t xml:space="preserve"> and a replication factor of 1, this configuration limited data redundancy against data loss. In addition, the provided Docker configuration did not include a separate Secondary </w:t>
+      </w:r>
+      <w:proofErr w:type="spellStart"/>
+      <w:r>
+        <w:t>NameNode</w:t>
+      </w:r>
+      <w:proofErr w:type="spellEnd"/>
+      <w:r>
+        <w:t xml:space="preserve"> container. Since the </w:t>
+      </w:r>
+      <w:r>
+        <w:lastRenderedPageBreak/>
+        <w:t xml:space="preserve">project was implemented based on the Hadoop Docker configuration provided in the course, a separate Secondary </w:t>
+      </w:r>
+      <w:proofErr w:type="spellStart"/>
+      <w:r>
+        <w:t>NameNode</w:t>
+      </w:r>
+      <w:proofErr w:type="spellEnd"/>
+      <w:r>
+        <w:t xml:space="preserve"> container was not added in order to avoid changing the existing structure and to maintain the integrity of the project. Therefore, the Secondary </w:t>
+      </w:r>
+      <w:proofErr w:type="spellStart"/>
+      <w:r>
+        <w:t>NameNode</w:t>
+      </w:r>
+      <w:proofErr w:type="spellEnd"/>
+      <w:r>
+        <w:t xml:space="preserve"> and checkpointing mechanism were explained theoretically but were not implemented as a separate service.</w:t>
+      </w:r>
+    </w:p>
     <w:p/>
     <w:p>
       <w:pPr>
@@ -1801,7 +2505,6 @@
         </w:numPr>
       </w:pPr>
       <w:r>
-        <w:lastRenderedPageBreak/>
         <w:t>TASK 3: Distributed Processing</w:t>
       </w:r>
     </w:p>
@@ -2058,7 +2761,7 @@
       <w:r>
         <w:t xml:space="preserve"> </w:t>
       </w:r>
-      <w:hyperlink r:id="rId13" w:tgtFrame="_new" w:history="1">
+      <w:hyperlink r:id="rId18" w:tgtFrame="_new" w:history="1">
         <w:r>
           <w:rPr>
             <w:rStyle w:val="Hyperlink"/>
@@ -2141,7 +2844,7 @@
       <w:r>
         <w:t xml:space="preserve">Available at: </w:t>
       </w:r>
-      <w:hyperlink r:id="rId14" w:history="1">
+      <w:hyperlink r:id="rId19" w:history="1">
         <w:r>
           <w:rPr>
             <w:rStyle w:val="Hyperlink"/>
@@ -2220,7 +2923,7 @@
       <w:r>
         <w:t xml:space="preserve">Available at: </w:t>
       </w:r>
-      <w:hyperlink r:id="rId15" w:history="1">
+      <w:hyperlink r:id="rId20" w:history="1">
         <w:r>
           <w:rPr>
             <w:rStyle w:val="Hyperlink"/>
@@ -2255,6 +2958,114 @@
     </w:p>
     <w:p>
       <w:pPr>
+        <w:pStyle w:val="ListParagraph"/>
+        <w:numPr>
+          <w:ilvl w:val="0"/>
+          <w:numId w:val="9"/>
+        </w:numPr>
+      </w:pPr>
+      <w:r>
+        <w:t xml:space="preserve">Apache Hadoop (2026) </w:t>
+      </w:r>
+      <w:r>
+        <w:rPr>
+          <w:i/>
+          <w:iCs/>
+        </w:rPr>
+        <w:t>Apache Hadoop Documentation</w:t>
+      </w:r>
+      <w:r>
+        <w:t xml:space="preserve">. </w:t>
+      </w:r>
+    </w:p>
+    <w:p>
+      <w:pPr>
+        <w:pStyle w:val="ListParagraph"/>
+        <w:ind w:left="360"/>
+      </w:pPr>
+      <w:r>
+        <w:t xml:space="preserve">Available at: </w:t>
+      </w:r>
+      <w:hyperlink r:id="rId21" w:history="1">
+        <w:r>
+          <w:rPr>
+            <w:rStyle w:val="Hyperlink"/>
+          </w:rPr>
+          <w:t>https://hadoop.apache.org/</w:t>
+        </w:r>
+      </w:hyperlink>
+      <w:r>
+        <w:t xml:space="preserve"> </w:t>
+      </w:r>
+      <w:r>
+        <w:t xml:space="preserve"> </w:t>
+      </w:r>
+      <w:r>
+        <w:t xml:space="preserve">  </w:t>
+      </w:r>
+    </w:p>
+    <w:p>
+      <w:pPr>
+        <w:pStyle w:val="ListParagraph"/>
+        <w:ind w:left="360"/>
+      </w:pPr>
+      <w:r>
+        <w:t>(Accessed: 18 September 2026).</w:t>
+      </w:r>
+    </w:p>
+    <w:p>
+      <w:pPr>
+        <w:pStyle w:val="ListParagraph"/>
+        <w:numPr>
+          <w:ilvl w:val="0"/>
+          <w:numId w:val="9"/>
+        </w:numPr>
+      </w:pPr>
+      <w:r>
+        <w:t xml:space="preserve">Apache Spark (2026) </w:t>
+      </w:r>
+      <w:r>
+        <w:rPr>
+          <w:i/>
+          <w:iCs/>
+        </w:rPr>
+        <w:t>Apache Spark Documentation</w:t>
+      </w:r>
+      <w:r>
+        <w:t xml:space="preserve">. </w:t>
+      </w:r>
+    </w:p>
+    <w:p>
+      <w:pPr>
+        <w:pStyle w:val="ListParagraph"/>
+        <w:ind w:left="360"/>
+      </w:pPr>
+      <w:r>
+        <w:t xml:space="preserve">Available at: </w:t>
+      </w:r>
+      <w:hyperlink r:id="rId22" w:history="1">
+        <w:r>
+          <w:rPr>
+            <w:rStyle w:val="Hyperlink"/>
+          </w:rPr>
+          <w:t>https://spark.apache.org/</w:t>
+        </w:r>
+      </w:hyperlink>
+      <w:r>
+        <w:t xml:space="preserve"> </w:t>
+      </w:r>
+    </w:p>
+    <w:p>
+      <w:pPr>
+        <w:pStyle w:val="ListParagraph"/>
+        <w:ind w:left="360"/>
+      </w:pPr>
+      <w:r>
+        <w:t>(Accessed: 18 September 2026).</w:t>
+      </w:r>
+    </w:p>
+    <w:p>
+      <w:pPr>
         <w:rPr>
           <w:lang w:val="el-GR"/>
         </w:rPr>
@@ -2309,8 +3120,8 @@
       </w:pPr>
     </w:p>
     <w:sectPr>
-      <w:footerReference w:type="even" r:id="rId16"/>
-      <w:footerReference w:type="default" r:id="rId17"/>
+      <w:footerReference w:type="even" r:id="rId23"/>
+      <w:footerReference w:type="default" r:id="rId24"/>
       <w:pgSz w:w="12240" w:h="15840"/>
       <w:pgMar w:top="1440" w:right="1440" w:bottom="1440" w:left="1440" w:header="720" w:footer="720" w:gutter="0"/>
       <w:pgBorders w:display="notFirstPage" w:offsetFrom="page">

</xml_diff>